<commit_message>
In-house alternative: maintenance by developer and DBA, analytics in code
No BI tool in this scenario, so analytics waves are built in-house.
Adds design decisions to make in the MVP (metric views in the DW,
reusable chart components, shared filters, audited CSV export, history
preservation), a wave-2 roadmap with developer and DBA estimates and
capacity scenarios, key-person and dual-role risks, and an open question
on whether existing Microsoft 365 licenses already include Power BI.

Co-Authored-By: Claude Opus 5.5 <noreply@anthropic.com>
Claude-Session: https://claude.ai/code/session_01YcEMp91cmPuH2YbvGBFx73
</commit_message>
<xml_diff>
--- a/docs/MVP-InHouse.docx
+++ b/docs/MVP-InHouse.docx
@@ -30,8 +30,8 @@
         <w:tblLayout w:type="fixed"/>
       </w:tblPr>
       <w:tblGrid>
-        <w:gridCol w:w="1493"/>
-        <w:gridCol w:w="8145"/>
+        <w:gridCol w:w="1823"/>
+        <w:gridCol w:w="7815"/>
       </w:tblGrid>
       <w:tr>
         <w:trPr>
@@ -39,7 +39,7 @@
         </w:trPr>
         <w:tc>
           <w:tcPr>
-            <w:tcW w:type="dxa" w:w="1493"/>
+            <w:tcW w:type="dxa" w:w="1823"/>
             <w:tcBorders>
               <w:top w:val="single" w:color="BFBFBF" w:sz="4"/>
               <w:left w:val="single" w:color="BFBFBF" w:sz="4"/>
@@ -74,7 +74,7 @@
         </w:tc>
         <w:tc>
           <w:tcPr>
-            <w:tcW w:type="dxa" w:w="8145"/>
+            <w:tcW w:type="dxa" w:w="7815"/>
             <w:tcBorders>
               <w:top w:val="single" w:color="BFBFBF" w:sz="4"/>
               <w:left w:val="single" w:color="BFBFBF" w:sz="4"/>
@@ -111,7 +111,7 @@
         </w:trPr>
         <w:tc>
           <w:tcPr>
-            <w:tcW w:type="dxa" w:w="1493"/>
+            <w:tcW w:type="dxa" w:w="1823"/>
             <w:tcBorders>
               <w:top w:val="single" w:color="BFBFBF" w:sz="4"/>
               <w:left w:val="single" w:color="BFBFBF" w:sz="4"/>
@@ -146,7 +146,7 @@
         </w:tc>
         <w:tc>
           <w:tcPr>
-            <w:tcW w:type="dxa" w:w="8145"/>
+            <w:tcW w:type="dxa" w:w="7815"/>
             <w:tcBorders>
               <w:top w:val="single" w:color="BFBFBF" w:sz="4"/>
               <w:left w:val="single" w:color="BFBFBF" w:sz="4"/>
@@ -183,7 +183,7 @@
         </w:trPr>
         <w:tc>
           <w:tcPr>
-            <w:tcW w:type="dxa" w:w="1493"/>
+            <w:tcW w:type="dxa" w:w="1823"/>
             <w:tcBorders>
               <w:top w:val="single" w:color="BFBFBF" w:sz="4"/>
               <w:left w:val="single" w:color="BFBFBF" w:sz="4"/>
@@ -218,7 +218,7 @@
         </w:tc>
         <w:tc>
           <w:tcPr>
-            <w:tcW w:type="dxa" w:w="8145"/>
+            <w:tcW w:type="dxa" w:w="7815"/>
             <w:tcBorders>
               <w:top w:val="single" w:color="BFBFBF" w:sz="4"/>
               <w:left w:val="single" w:color="BFBFBF" w:sz="4"/>
@@ -255,7 +255,7 @@
         </w:trPr>
         <w:tc>
           <w:tcPr>
-            <w:tcW w:type="dxa" w:w="1493"/>
+            <w:tcW w:type="dxa" w:w="1823"/>
             <w:tcBorders>
               <w:top w:val="single" w:color="BFBFBF" w:sz="4"/>
               <w:left w:val="single" w:color="BFBFBF" w:sz="4"/>
@@ -290,7 +290,7 @@
         </w:tc>
         <w:tc>
           <w:tcPr>
-            <w:tcW w:type="dxa" w:w="8145"/>
+            <w:tcW w:type="dxa" w:w="7815"/>
             <w:tcBorders>
               <w:top w:val="single" w:color="BFBFBF" w:sz="4"/>
               <w:left w:val="single" w:color="BFBFBF" w:sz="4"/>
@@ -317,6 +317,78 @@
                 <w:rtl/>
               </w:rPr>
               <w:t xml:space="preserve">Salesforce נשארת מערכת התמיכה (קייסים, בקשות, SLA). ה-DW נשאר מקור הנתונים</w:t>
+            </w:r>
+          </w:p>
+        </w:tc>
+      </w:tr>
+      <w:tr>
+        <w:trPr>
+          <w:tblHeader w:val="false"/>
+        </w:trPr>
+        <w:tc>
+          <w:tcPr>
+            <w:tcW w:type="dxa" w:w="1823"/>
+            <w:tcBorders>
+              <w:top w:val="single" w:color="BFBFBF" w:sz="4"/>
+              <w:left w:val="single" w:color="BFBFBF" w:sz="4"/>
+              <w:bottom w:val="single" w:color="BFBFBF" w:sz="4"/>
+              <w:right w:val="single" w:color="BFBFBF" w:sz="4"/>
+            </w:tcBorders>
+            <w:shd w:fill="F2F2F2" w:color="auto" w:val="clear"/>
+            <w:tcMar>
+              <w:top w:type="dxa" w:w="60"/>
+              <w:left w:type="dxa" w:w="100"/>
+              <w:bottom w:type="dxa" w:w="60"/>
+              <w:right w:type="dxa" w:w="100"/>
+            </w:tcMar>
+          </w:tcPr>
+          <w:p>
+            <w:pPr>
+              <w:bidi/>
+              <w:spacing w:after="0"/>
+            </w:pPr>
+            <w:r>
+              <w:rPr>
+                <w:rFonts w:ascii="Arial" w:cs="Arial" w:eastAsia="Arial" w:hAnsi="Arial"/>
+                <w:b/>
+                <w:bCs/>
+                <w:sz w:val="19"/>
+                <w:szCs w:val="19"/>
+                <w:rtl/>
+              </w:rPr>
+              <w:t xml:space="preserve">החלטות שהתקבלו</w:t>
+            </w:r>
+          </w:p>
+        </w:tc>
+        <w:tc>
+          <w:tcPr>
+            <w:tcW w:type="dxa" w:w="7815"/>
+            <w:tcBorders>
+              <w:top w:val="single" w:color="BFBFBF" w:sz="4"/>
+              <w:left w:val="single" w:color="BFBFBF" w:sz="4"/>
+              <w:bottom w:val="single" w:color="BFBFBF" w:sz="4"/>
+              <w:right w:val="single" w:color="BFBFBF" w:sz="4"/>
+            </w:tcBorders>
+            <w:tcMar>
+              <w:top w:type="dxa" w:w="60"/>
+              <w:left w:type="dxa" w:w="100"/>
+              <w:bottom w:type="dxa" w:w="60"/>
+              <w:right w:type="dxa" w:w="100"/>
+            </w:tcMar>
+          </w:tcPr>
+          <w:p>
+            <w:pPr>
+              <w:bidi/>
+              <w:spacing w:after="0"/>
+            </w:pPr>
+            <w:r>
+              <w:rPr>
+                <w:rFonts w:ascii="Arial" w:cs="Arial" w:eastAsia="Arial" w:hAnsi="Arial"/>
+                <w:sz w:val="19"/>
+                <w:szCs w:val="19"/>
+                <w:rtl/>
+              </w:rPr>
+              <w:t xml:space="preserve">אין כלי BI בתרחיש הזה. האנליטיקה תפותח כחלק מהמערכת. אחרי העלייה לאוויר: מפתח ו-DBA מתחזקים ומפתחים</w:t>
             </w:r>
           </w:p>
         </w:tc>
@@ -1293,7 +1365,7 @@
           <w:bCs/>
           <w:rtl/>
         </w:rPr>
-        <w:t xml:space="preserve">ההמלצה שלי:</w:t>
+        <w:t xml:space="preserve">ההמלצה שלי, בהינתן שאין כלי BI והאנליטיקה תפותח בבית:</w:t>
       </w:r>
     </w:p>
     <w:p>
@@ -1314,14 +1386,14 @@
           <w:bCs/>
           <w:rtl/>
         </w:rPr>
-        <w:t xml:space="preserve">פיתוח פנימי מתאים למסך החי.</w:t>
+        <w:t xml:space="preserve">המסך החי מתאים לפיתוח פנימי מכל בחינה.</w:t>
       </w:r>
       <w:r>
         <w:rPr>
           <w:rFonts w:ascii="Arial" w:cs="Arial" w:eastAsia="Arial" w:hAnsi="Arial"/>
           <w:rtl/>
         </w:rPr>
-        <w:t xml:space="preserve"> זה מסך תפעולי, ולא כלי ניתוח: שלושה מספרים ושתי רשימות שחייבים להתעדכן מהר. כאן שליטה מלאה ברענון שווה יותר מגמישות של כלי BI.</w:t>
+        <w:t xml:space="preserve"> זה מסך תפעולי של שלושה מספרים ושתי רשימות, ושליטה מלאה ברענון שווה כאן יותר מכלי BI.</w:t>
       </w:r>
     </w:p>
     <w:p>
@@ -1342,14 +1414,98 @@
           <w:bCs/>
           <w:rtl/>
         </w:rPr>
-        <w:t xml:space="preserve">פיתוח פנימי לא מתאים לגלים האנליטיים.</w:t>
+        <w:t xml:space="preserve">הגלים האנליטיים יעבדו בפיתוח פנימי רק אם מתכננים אותם כבר עכשיו.</w:t>
       </w:r>
       <w:r>
         <w:rPr>
           <w:rFonts w:ascii="Arial" w:cs="Arial" w:eastAsia="Arial" w:hAnsi="Arial"/>
           <w:rtl/>
         </w:rPr>
-        <w:t xml:space="preserve"> אם בהמשך תרצו טרנדים, דירוגים וחיתוכים, לבנות כל אחד מהם בקוד יהיה יקר ואיטי בהרבה מכלי BI.</w:t>
+        <w:t xml:space="preserve"> בלי כלי BI, כל גרף, מסנן וייצוא נכתבים בקוד. כדי שזה לא יהפוך לפרויקט אינסופי, צריך שלושה דברים מהיום הראשון:</w:t>
+      </w:r>
+    </w:p>
+    <w:p>
+      <w:pPr>
+        <w:pStyle w:val="ListParagraph"/>
+        <w:numPr>
+          <w:ilvl w:val="0"/>
+          <w:numId w:val="3"/>
+        </w:numPr>
+        <w:bidi/>
+        <w:spacing w:after="60"/>
+        <w:jc w:val="start"/>
+      </w:pPr>
+      <w:r>
+        <w:rPr>
+          <w:rFonts w:ascii="Arial" w:cs="Arial" w:eastAsia="Arial" w:hAnsi="Arial"/>
+          <w:b/>
+          <w:bCs/>
+          <w:rtl/>
+        </w:rPr>
+        <w:t xml:space="preserve">הגדרות המדדים ב-DW ולא בקוד:</w:t>
+      </w:r>
+      <w:r>
+        <w:rPr>
+          <w:rFonts w:ascii="Arial" w:cs="Arial" w:eastAsia="Arial" w:hAnsi="Arial"/>
+          <w:rtl/>
+        </w:rPr>
+        <w:t xml:space="preserve"> כל מדד הוא view, והאפליקציה רק מציגה אותו (סעיף 4.1).</w:t>
+      </w:r>
+    </w:p>
+    <w:p>
+      <w:pPr>
+        <w:pStyle w:val="ListParagraph"/>
+        <w:numPr>
+          <w:ilvl w:val="0"/>
+          <w:numId w:val="3"/>
+        </w:numPr>
+        <w:bidi/>
+        <w:spacing w:after="60"/>
+        <w:jc w:val="start"/>
+      </w:pPr>
+      <w:r>
+        <w:rPr>
+          <w:rFonts w:ascii="Arial" w:cs="Arial" w:eastAsia="Arial" w:hAnsi="Arial"/>
+          <w:b/>
+          <w:bCs/>
+          <w:rtl/>
+        </w:rPr>
+        <w:t xml:space="preserve">ספריית רכיבים חוזרים:</w:t>
+      </w:r>
+      <w:r>
+        <w:rPr>
+          <w:rFonts w:ascii="Arial" w:cs="Arial" w:eastAsia="Arial" w:hAnsi="Arial"/>
+          <w:rtl/>
+        </w:rPr>
+        <w:t xml:space="preserve"> אריח, טבלה, גרף עמודות, גרף קו ומפת חום. כל מסך חדש מורכב מהם, ולא נכתב מאפס.</w:t>
+      </w:r>
+    </w:p>
+    <w:p>
+      <w:pPr>
+        <w:pStyle w:val="ListParagraph"/>
+        <w:numPr>
+          <w:ilvl w:val="0"/>
+          <w:numId w:val="3"/>
+        </w:numPr>
+        <w:bidi/>
+        <w:spacing w:after="60"/>
+        <w:jc w:val="start"/>
+      </w:pPr>
+      <w:r>
+        <w:rPr>
+          <w:rFonts w:ascii="Arial" w:cs="Arial" w:eastAsia="Arial" w:hAnsi="Arial"/>
+          <w:b/>
+          <w:bCs/>
+          <w:rtl/>
+        </w:rPr>
+        <w:t xml:space="preserve">ייצוא ל-CSV מכל טבלה:</w:t>
+      </w:r>
+      <w:r>
+        <w:rPr>
+          <w:rFonts w:ascii="Arial" w:cs="Arial" w:eastAsia="Arial" w:hAnsi="Arial"/>
+          <w:rtl/>
+        </w:rPr>
+        <w:t xml:space="preserve"> בלי כלי BI, זו הדרך היחידה לענות על שאלה חד-פעמית בלי לפתוח משימת פיתוח.</w:t>
       </w:r>
     </w:p>
     <w:p>
@@ -1370,14 +1526,14 @@
           <w:bCs/>
           <w:rtl/>
         </w:rPr>
-        <w:t xml:space="preserve">המסקנה:</w:t>
+        <w:t xml:space="preserve">"מפתח ו-DBA מתחזקים" זה בפועל פיתוח מתמשך, לא רק תחזוקה.</w:t>
       </w:r>
       <w:r>
         <w:rPr>
           <w:rFonts w:ascii="Arial" w:cs="Arial" w:eastAsia="Arial" w:hAnsi="Arial"/>
           <w:rtl/>
         </w:rPr>
-        <w:t xml:space="preserve"> אם בוחרים בפיתוח פנימי, כדאי להחליט כבר עכשיו מה עושים עם הגל האנליטי. האפשרויות: כלי BI אחר שכבר יש בארגון, או תקציב פיתוח מתמשך.</w:t>
+        <w:t xml:space="preserve"> אם אותו מפתח גם מתחזק וגם בונה את הגלים האנליטיים, הוא צריך להיות במשרה מלאה על המערכת, לתקופה ארוכה (סעיף 7.4).</w:t>
       </w:r>
     </w:p>
     <w:p>
@@ -4268,6 +4424,804 @@
     </w:p>
     <w:p>
       <w:pPr>
+        <w:pStyle w:val="Heading2"/>
+        <w:bidi/>
+      </w:pPr>
+      <w:r>
+        <w:rPr>
+          <w:rFonts w:ascii="Arial" w:cs="Arial" w:eastAsia="Arial" w:hAnsi="Arial"/>
+          <w:rtl/>
+        </w:rPr>
+        <w:t xml:space="preserve">4.1 תכנון לאנליטיקה בלי כלי BI</w:t>
+      </w:r>
+    </w:p>
+    <w:p>
+      <w:pPr>
+        <w:bidi/>
+        <w:spacing w:after="120" w:line="276"/>
+        <w:jc w:val="start"/>
+      </w:pPr>
+      <w:r>
+        <w:rPr>
+          <w:rFonts w:ascii="Arial" w:cs="Arial" w:eastAsia="Arial" w:hAnsi="Arial"/>
+          <w:rtl/>
+        </w:rPr>
+        <w:t xml:space="preserve">ה-MVP כולל רק את המסך החי, אבל כמה החלטות צריך לקבל כבר בו, כדי שהגלים הבאים לא ידרשו לבנות מחדש:</w:t>
+      </w:r>
+    </w:p>
+    <w:tbl>
+      <w:tblPr>
+        <w:bidiVisual/>
+        <w:tblW w:type="dxa" w:w="9638"/>
+        <w:tblBorders>
+          <w:top w:val="single" w:color="auto" w:sz="4"/>
+          <w:left w:val="single" w:color="auto" w:sz="4"/>
+          <w:bottom w:val="single" w:color="auto" w:sz="4"/>
+          <w:right w:val="single" w:color="auto" w:sz="4"/>
+          <w:insideH w:val="single" w:color="auto" w:sz="4"/>
+          <w:insideV w:val="single" w:color="auto" w:sz="4"/>
+        </w:tblBorders>
+        <w:tblLayout w:type="fixed"/>
+      </w:tblPr>
+      <w:tblGrid>
+        <w:gridCol w:w="1070"/>
+        <w:gridCol w:w="4285"/>
+        <w:gridCol w:w="4283"/>
+      </w:tblGrid>
+      <w:tr>
+        <w:trPr>
+          <w:tblHeader/>
+        </w:trPr>
+        <w:tc>
+          <w:tcPr>
+            <w:tcW w:type="dxa" w:w="1070"/>
+            <w:tcBorders>
+              <w:top w:val="single" w:color="BFBFBF" w:sz="4"/>
+              <w:left w:val="single" w:color="BFBFBF" w:sz="4"/>
+              <w:bottom w:val="single" w:color="BFBFBF" w:sz="4"/>
+              <w:right w:val="single" w:color="BFBFBF" w:sz="4"/>
+            </w:tcBorders>
+            <w:shd w:fill="DCE6F1" w:color="auto" w:val="clear"/>
+            <w:tcMar>
+              <w:top w:type="dxa" w:w="60"/>
+              <w:left w:type="dxa" w:w="100"/>
+              <w:bottom w:type="dxa" w:w="60"/>
+              <w:right w:type="dxa" w:w="100"/>
+            </w:tcMar>
+          </w:tcPr>
+          <w:p>
+            <w:pPr>
+              <w:bidi/>
+              <w:spacing w:after="0"/>
+            </w:pPr>
+            <w:r>
+              <w:rPr>
+                <w:rFonts w:ascii="Arial" w:cs="Arial" w:eastAsia="Arial" w:hAnsi="Arial"/>
+                <w:b/>
+                <w:bCs/>
+                <w:sz w:val="19"/>
+                <w:szCs w:val="19"/>
+                <w:rtl/>
+              </w:rPr>
+              <w:t xml:space="preserve">החלטה</w:t>
+            </w:r>
+          </w:p>
+        </w:tc>
+        <w:tc>
+          <w:tcPr>
+            <w:tcW w:type="dxa" w:w="4285"/>
+            <w:tcBorders>
+              <w:top w:val="single" w:color="BFBFBF" w:sz="4"/>
+              <w:left w:val="single" w:color="BFBFBF" w:sz="4"/>
+              <w:bottom w:val="single" w:color="BFBFBF" w:sz="4"/>
+              <w:right w:val="single" w:color="BFBFBF" w:sz="4"/>
+            </w:tcBorders>
+            <w:shd w:fill="DCE6F1" w:color="auto" w:val="clear"/>
+            <w:tcMar>
+              <w:top w:type="dxa" w:w="60"/>
+              <w:left w:type="dxa" w:w="100"/>
+              <w:bottom w:type="dxa" w:w="60"/>
+              <w:right w:type="dxa" w:w="100"/>
+            </w:tcMar>
+          </w:tcPr>
+          <w:p>
+            <w:pPr>
+              <w:bidi/>
+              <w:spacing w:after="0"/>
+            </w:pPr>
+            <w:r>
+              <w:rPr>
+                <w:rFonts w:ascii="Arial" w:cs="Arial" w:eastAsia="Arial" w:hAnsi="Arial"/>
+                <w:b/>
+                <w:bCs/>
+                <w:sz w:val="19"/>
+                <w:szCs w:val="19"/>
+                <w:rtl/>
+              </w:rPr>
+              <w:t xml:space="preserve">מה עושים כבר ב-MVP</w:t>
+            </w:r>
+          </w:p>
+        </w:tc>
+        <w:tc>
+          <w:tcPr>
+            <w:tcW w:type="dxa" w:w="4283"/>
+            <w:tcBorders>
+              <w:top w:val="single" w:color="BFBFBF" w:sz="4"/>
+              <w:left w:val="single" w:color="BFBFBF" w:sz="4"/>
+              <w:bottom w:val="single" w:color="BFBFBF" w:sz="4"/>
+              <w:right w:val="single" w:color="BFBFBF" w:sz="4"/>
+            </w:tcBorders>
+            <w:shd w:fill="DCE6F1" w:color="auto" w:val="clear"/>
+            <w:tcMar>
+              <w:top w:type="dxa" w:w="60"/>
+              <w:left w:type="dxa" w:w="100"/>
+              <w:bottom w:type="dxa" w:w="60"/>
+              <w:right w:type="dxa" w:w="100"/>
+            </w:tcMar>
+          </w:tcPr>
+          <w:p>
+            <w:pPr>
+              <w:bidi/>
+              <w:spacing w:after="0"/>
+            </w:pPr>
+            <w:r>
+              <w:rPr>
+                <w:rFonts w:ascii="Arial" w:cs="Arial" w:eastAsia="Arial" w:hAnsi="Arial"/>
+                <w:b/>
+                <w:bCs/>
+                <w:sz w:val="19"/>
+                <w:szCs w:val="19"/>
+                <w:rtl/>
+              </w:rPr>
+              <w:t xml:space="preserve">למה</w:t>
+            </w:r>
+          </w:p>
+        </w:tc>
+      </w:tr>
+      <w:tr>
+        <w:trPr>
+          <w:tblHeader w:val="false"/>
+        </w:trPr>
+        <w:tc>
+          <w:tcPr>
+            <w:tcW w:type="dxa" w:w="1070"/>
+            <w:tcBorders>
+              <w:top w:val="single" w:color="BFBFBF" w:sz="4"/>
+              <w:left w:val="single" w:color="BFBFBF" w:sz="4"/>
+              <w:bottom w:val="single" w:color="BFBFBF" w:sz="4"/>
+              <w:right w:val="single" w:color="BFBFBF" w:sz="4"/>
+            </w:tcBorders>
+            <w:tcMar>
+              <w:top w:type="dxa" w:w="60"/>
+              <w:left w:type="dxa" w:w="100"/>
+              <w:bottom w:type="dxa" w:w="60"/>
+              <w:right w:type="dxa" w:w="100"/>
+            </w:tcMar>
+          </w:tcPr>
+          <w:p>
+            <w:pPr>
+              <w:bidi/>
+              <w:spacing w:after="0"/>
+            </w:pPr>
+            <w:r>
+              <w:rPr>
+                <w:rFonts w:ascii="Arial" w:cs="Arial" w:eastAsia="Arial" w:hAnsi="Arial"/>
+                <w:b/>
+                <w:bCs/>
+                <w:sz w:val="19"/>
+                <w:szCs w:val="19"/>
+                <w:rtl/>
+              </w:rPr>
+              <w:t xml:space="preserve">שכבת מדדים ב-DW</w:t>
+            </w:r>
+          </w:p>
+        </w:tc>
+        <w:tc>
+          <w:tcPr>
+            <w:tcW w:type="dxa" w:w="4285"/>
+            <w:tcBorders>
+              <w:top w:val="single" w:color="BFBFBF" w:sz="4"/>
+              <w:left w:val="single" w:color="BFBFBF" w:sz="4"/>
+              <w:bottom w:val="single" w:color="BFBFBF" w:sz="4"/>
+              <w:right w:val="single" w:color="BFBFBF" w:sz="4"/>
+            </w:tcBorders>
+            <w:tcMar>
+              <w:top w:type="dxa" w:w="60"/>
+              <w:left w:type="dxa" w:w="100"/>
+              <w:bottom w:type="dxa" w:w="60"/>
+              <w:right w:type="dxa" w:w="100"/>
+            </w:tcMar>
+          </w:tcPr>
+          <w:p>
+            <w:pPr>
+              <w:bidi/>
+              <w:spacing w:after="0"/>
+            </w:pPr>
+            <w:r>
+              <w:rPr>
+                <w:rFonts w:ascii="Arial" w:cs="Arial" w:eastAsia="Arial" w:hAnsi="Arial"/>
+                <w:sz w:val="19"/>
+                <w:szCs w:val="19"/>
+                <w:rtl/>
+              </w:rPr>
+              <w:t xml:space="preserve">כל מדד מוגדר ב-view עם שם קבוע (למשל </w:t>
+            </w:r>
+            <w:r>
+              <w:rPr>
+                <w:rFonts w:ascii="Consolas" w:cs="Consolas" w:eastAsia="Consolas" w:hAnsi="Consolas"/>
+                <w:color w:val="444444"/>
+                <w:sz w:val="18"/>
+                <w:szCs w:val="18"/>
+              </w:rPr>
+              <w:t xml:space="preserve">support.v_live_sla_at_risk</w:t>
+            </w:r>
+            <w:r>
+              <w:rPr>
+                <w:rFonts w:ascii="Arial" w:cs="Arial" w:eastAsia="Arial" w:hAnsi="Arial"/>
+                <w:sz w:val="19"/>
+                <w:szCs w:val="19"/>
+                <w:rtl/>
+              </w:rPr>
+              <w:t xml:space="preserve">), ומתועד מול מילון המדדים</w:t>
+            </w:r>
+          </w:p>
+        </w:tc>
+        <w:tc>
+          <w:tcPr>
+            <w:tcW w:type="dxa" w:w="4283"/>
+            <w:tcBorders>
+              <w:top w:val="single" w:color="BFBFBF" w:sz="4"/>
+              <w:left w:val="single" w:color="BFBFBF" w:sz="4"/>
+              <w:bottom w:val="single" w:color="BFBFBF" w:sz="4"/>
+              <w:right w:val="single" w:color="BFBFBF" w:sz="4"/>
+            </w:tcBorders>
+            <w:tcMar>
+              <w:top w:type="dxa" w:w="60"/>
+              <w:left w:type="dxa" w:w="100"/>
+              <w:bottom w:type="dxa" w:w="60"/>
+              <w:right w:type="dxa" w:w="100"/>
+            </w:tcMar>
+          </w:tcPr>
+          <w:p>
+            <w:pPr>
+              <w:bidi/>
+              <w:spacing w:after="0"/>
+            </w:pPr>
+            <w:r>
+              <w:rPr>
+                <w:rFonts w:ascii="Arial" w:cs="Arial" w:eastAsia="Arial" w:hAnsi="Arial"/>
+                <w:sz w:val="19"/>
+                <w:szCs w:val="19"/>
+                <w:rtl/>
+              </w:rPr>
+              <w:t xml:space="preserve">שינוי הגדרה הוא שינוי ב-view אחד, בלי לגעת בקוד. ה-DBA יכול לתחזק את ההגדרות לבד</w:t>
+            </w:r>
+          </w:p>
+        </w:tc>
+      </w:tr>
+      <w:tr>
+        <w:trPr>
+          <w:tblHeader w:val="false"/>
+        </w:trPr>
+        <w:tc>
+          <w:tcPr>
+            <w:tcW w:type="dxa" w:w="1070"/>
+            <w:tcBorders>
+              <w:top w:val="single" w:color="BFBFBF" w:sz="4"/>
+              <w:left w:val="single" w:color="BFBFBF" w:sz="4"/>
+              <w:bottom w:val="single" w:color="BFBFBF" w:sz="4"/>
+              <w:right w:val="single" w:color="BFBFBF" w:sz="4"/>
+            </w:tcBorders>
+            <w:tcMar>
+              <w:top w:type="dxa" w:w="60"/>
+              <w:left w:type="dxa" w:w="100"/>
+              <w:bottom w:type="dxa" w:w="60"/>
+              <w:right w:type="dxa" w:w="100"/>
+            </w:tcMar>
+          </w:tcPr>
+          <w:p>
+            <w:pPr>
+              <w:bidi/>
+              <w:spacing w:after="0"/>
+            </w:pPr>
+            <w:r>
+              <w:rPr>
+                <w:rFonts w:ascii="Arial" w:cs="Arial" w:eastAsia="Arial" w:hAnsi="Arial"/>
+                <w:b/>
+                <w:bCs/>
+                <w:sz w:val="19"/>
+                <w:szCs w:val="19"/>
+                <w:rtl/>
+              </w:rPr>
+              <w:t xml:space="preserve">ספריית רכיבים</w:t>
+            </w:r>
+          </w:p>
+        </w:tc>
+        <w:tc>
+          <w:tcPr>
+            <w:tcW w:type="dxa" w:w="4285"/>
+            <w:tcBorders>
+              <w:top w:val="single" w:color="BFBFBF" w:sz="4"/>
+              <w:left w:val="single" w:color="BFBFBF" w:sz="4"/>
+              <w:bottom w:val="single" w:color="BFBFBF" w:sz="4"/>
+              <w:right w:val="single" w:color="BFBFBF" w:sz="4"/>
+            </w:tcBorders>
+            <w:tcMar>
+              <w:top w:type="dxa" w:w="60"/>
+              <w:left w:type="dxa" w:w="100"/>
+              <w:bottom w:type="dxa" w:w="60"/>
+              <w:right w:type="dxa" w:w="100"/>
+            </w:tcMar>
+          </w:tcPr>
+          <w:p>
+            <w:pPr>
+              <w:bidi/>
+              <w:spacing w:after="0"/>
+            </w:pPr>
+            <w:r>
+              <w:rPr>
+                <w:rFonts w:ascii="Arial" w:cs="Arial" w:eastAsia="Arial" w:hAnsi="Arial"/>
+                <w:sz w:val="19"/>
+                <w:szCs w:val="19"/>
+                <w:rtl/>
+              </w:rPr>
+              <w:t xml:space="preserve">האריחים והטבלאות של המסך החי נבנים כרכיבים כלליים, עם ספריית גרפים קיימת (למשל Apache ECharts)</w:t>
+            </w:r>
+          </w:p>
+        </w:tc>
+        <w:tc>
+          <w:tcPr>
+            <w:tcW w:type="dxa" w:w="4283"/>
+            <w:tcBorders>
+              <w:top w:val="single" w:color="BFBFBF" w:sz="4"/>
+              <w:left w:val="single" w:color="BFBFBF" w:sz="4"/>
+              <w:bottom w:val="single" w:color="BFBFBF" w:sz="4"/>
+              <w:right w:val="single" w:color="BFBFBF" w:sz="4"/>
+            </w:tcBorders>
+            <w:tcMar>
+              <w:top w:type="dxa" w:w="60"/>
+              <w:left w:type="dxa" w:w="100"/>
+              <w:bottom w:type="dxa" w:w="60"/>
+              <w:right w:type="dxa" w:w="100"/>
+            </w:tcMar>
+          </w:tcPr>
+          <w:p>
+            <w:pPr>
+              <w:bidi/>
+              <w:spacing w:after="0"/>
+            </w:pPr>
+            <w:r>
+              <w:rPr>
+                <w:rFonts w:ascii="Arial" w:cs="Arial" w:eastAsia="Arial" w:hAnsi="Arial"/>
+                <w:sz w:val="19"/>
+                <w:szCs w:val="19"/>
+                <w:rtl/>
+              </w:rPr>
+              <w:t xml:space="preserve">כל מסך אנליטי בהמשך מורכב מרכיבים קיימים</w:t>
+            </w:r>
+          </w:p>
+        </w:tc>
+      </w:tr>
+      <w:tr>
+        <w:trPr>
+          <w:tblHeader w:val="false"/>
+        </w:trPr>
+        <w:tc>
+          <w:tcPr>
+            <w:tcW w:type="dxa" w:w="1070"/>
+            <w:tcBorders>
+              <w:top w:val="single" w:color="BFBFBF" w:sz="4"/>
+              <w:left w:val="single" w:color="BFBFBF" w:sz="4"/>
+              <w:bottom w:val="single" w:color="BFBFBF" w:sz="4"/>
+              <w:right w:val="single" w:color="BFBFBF" w:sz="4"/>
+            </w:tcBorders>
+            <w:tcMar>
+              <w:top w:type="dxa" w:w="60"/>
+              <w:left w:type="dxa" w:w="100"/>
+              <w:bottom w:type="dxa" w:w="60"/>
+              <w:right w:type="dxa" w:w="100"/>
+            </w:tcMar>
+          </w:tcPr>
+          <w:p>
+            <w:pPr>
+              <w:bidi/>
+              <w:spacing w:after="0"/>
+            </w:pPr>
+            <w:r>
+              <w:rPr>
+                <w:rFonts w:ascii="Arial" w:cs="Arial" w:eastAsia="Arial" w:hAnsi="Arial"/>
+                <w:b/>
+                <w:bCs/>
+                <w:sz w:val="19"/>
+                <w:szCs w:val="19"/>
+                <w:rtl/>
+              </w:rPr>
+              <w:t xml:space="preserve">API לפי מסכים</w:t>
+            </w:r>
+          </w:p>
+        </w:tc>
+        <w:tc>
+          <w:tcPr>
+            <w:tcW w:type="dxa" w:w="4285"/>
+            <w:tcBorders>
+              <w:top w:val="single" w:color="BFBFBF" w:sz="4"/>
+              <w:left w:val="single" w:color="BFBFBF" w:sz="4"/>
+              <w:bottom w:val="single" w:color="BFBFBF" w:sz="4"/>
+              <w:right w:val="single" w:color="BFBFBF" w:sz="4"/>
+            </w:tcBorders>
+            <w:tcMar>
+              <w:top w:type="dxa" w:w="60"/>
+              <w:left w:type="dxa" w:w="100"/>
+              <w:bottom w:type="dxa" w:w="60"/>
+              <w:right w:type="dxa" w:w="100"/>
+            </w:tcMar>
+          </w:tcPr>
+          <w:p>
+            <w:pPr>
+              <w:bidi/>
+              <w:spacing w:after="0"/>
+            </w:pPr>
+            <w:r>
+              <w:rPr>
+                <w:rFonts w:ascii="Arial" w:cs="Arial" w:eastAsia="Arial" w:hAnsi="Arial"/>
+                <w:sz w:val="19"/>
+                <w:szCs w:val="19"/>
+                <w:rtl/>
+              </w:rPr>
+              <w:t xml:space="preserve">כל מסך מקבל endpoint משלו, וכולם עוברים דרך אותה שכבת הרשאות</w:t>
+            </w:r>
+          </w:p>
+        </w:tc>
+        <w:tc>
+          <w:tcPr>
+            <w:tcW w:type="dxa" w:w="4283"/>
+            <w:tcBorders>
+              <w:top w:val="single" w:color="BFBFBF" w:sz="4"/>
+              <w:left w:val="single" w:color="BFBFBF" w:sz="4"/>
+              <w:bottom w:val="single" w:color="BFBFBF" w:sz="4"/>
+              <w:right w:val="single" w:color="BFBFBF" w:sz="4"/>
+            </w:tcBorders>
+            <w:tcMar>
+              <w:top w:type="dxa" w:w="60"/>
+              <w:left w:type="dxa" w:w="100"/>
+              <w:bottom w:type="dxa" w:w="60"/>
+              <w:right w:type="dxa" w:w="100"/>
+            </w:tcMar>
+          </w:tcPr>
+          <w:p>
+            <w:pPr>
+              <w:bidi/>
+              <w:spacing w:after="0"/>
+            </w:pPr>
+            <w:r>
+              <w:rPr>
+                <w:rFonts w:ascii="Arial" w:cs="Arial" w:eastAsia="Arial" w:hAnsi="Arial"/>
+                <w:sz w:val="19"/>
+                <w:szCs w:val="19"/>
+                <w:rtl/>
+              </w:rPr>
+              <w:t xml:space="preserve">מסך חדש לא פותח פרצת הרשאות חדשה</w:t>
+            </w:r>
+          </w:p>
+        </w:tc>
+      </w:tr>
+      <w:tr>
+        <w:trPr>
+          <w:tblHeader w:val="false"/>
+        </w:trPr>
+        <w:tc>
+          <w:tcPr>
+            <w:tcW w:type="dxa" w:w="1070"/>
+            <w:tcBorders>
+              <w:top w:val="single" w:color="BFBFBF" w:sz="4"/>
+              <w:left w:val="single" w:color="BFBFBF" w:sz="4"/>
+              <w:bottom w:val="single" w:color="BFBFBF" w:sz="4"/>
+              <w:right w:val="single" w:color="BFBFBF" w:sz="4"/>
+            </w:tcBorders>
+            <w:tcMar>
+              <w:top w:type="dxa" w:w="60"/>
+              <w:left w:type="dxa" w:w="100"/>
+              <w:bottom w:type="dxa" w:w="60"/>
+              <w:right w:type="dxa" w:w="100"/>
+            </w:tcMar>
+          </w:tcPr>
+          <w:p>
+            <w:pPr>
+              <w:bidi/>
+              <w:spacing w:after="0"/>
+            </w:pPr>
+            <w:r>
+              <w:rPr>
+                <w:rFonts w:ascii="Arial" w:cs="Arial" w:eastAsia="Arial" w:hAnsi="Arial"/>
+                <w:b/>
+                <w:bCs/>
+                <w:sz w:val="19"/>
+                <w:szCs w:val="19"/>
+                <w:rtl/>
+              </w:rPr>
+              <w:t xml:space="preserve">מסננים משותפים</w:t>
+            </w:r>
+          </w:p>
+        </w:tc>
+        <w:tc>
+          <w:tcPr>
+            <w:tcW w:type="dxa" w:w="4285"/>
+            <w:tcBorders>
+              <w:top w:val="single" w:color="BFBFBF" w:sz="4"/>
+              <w:left w:val="single" w:color="BFBFBF" w:sz="4"/>
+              <w:bottom w:val="single" w:color="BFBFBF" w:sz="4"/>
+              <w:right w:val="single" w:color="BFBFBF" w:sz="4"/>
+            </w:tcBorders>
+            <w:tcMar>
+              <w:top w:type="dxa" w:w="60"/>
+              <w:left w:type="dxa" w:w="100"/>
+              <w:bottom w:type="dxa" w:w="60"/>
+              <w:right w:type="dxa" w:w="100"/>
+            </w:tcMar>
+          </w:tcPr>
+          <w:p>
+            <w:pPr>
+              <w:bidi/>
+              <w:spacing w:after="0"/>
+            </w:pPr>
+            <w:r>
+              <w:rPr>
+                <w:rFonts w:ascii="Arial" w:cs="Arial" w:eastAsia="Arial" w:hAnsi="Arial"/>
+                <w:sz w:val="19"/>
+                <w:szCs w:val="19"/>
+                <w:rtl/>
+              </w:rPr>
+              <w:t xml:space="preserve">רכיב אחד לטווח תאריכים, טיר, מוצר וגרסה. ב-MVP מופעל רק מסנן הטיר</w:t>
+            </w:r>
+          </w:p>
+        </w:tc>
+        <w:tc>
+          <w:tcPr>
+            <w:tcW w:type="dxa" w:w="4283"/>
+            <w:tcBorders>
+              <w:top w:val="single" w:color="BFBFBF" w:sz="4"/>
+              <w:left w:val="single" w:color="BFBFBF" w:sz="4"/>
+              <w:bottom w:val="single" w:color="BFBFBF" w:sz="4"/>
+              <w:right w:val="single" w:color="BFBFBF" w:sz="4"/>
+            </w:tcBorders>
+            <w:tcMar>
+              <w:top w:type="dxa" w:w="60"/>
+              <w:left w:type="dxa" w:w="100"/>
+              <w:bottom w:type="dxa" w:w="60"/>
+              <w:right w:type="dxa" w:w="100"/>
+            </w:tcMar>
+          </w:tcPr>
+          <w:p>
+            <w:pPr>
+              <w:bidi/>
+              <w:spacing w:after="0"/>
+            </w:pPr>
+            <w:r>
+              <w:rPr>
+                <w:rFonts w:ascii="Arial" w:cs="Arial" w:eastAsia="Arial" w:hAnsi="Arial"/>
+                <w:sz w:val="19"/>
+                <w:szCs w:val="19"/>
+                <w:rtl/>
+              </w:rPr>
+              <w:t xml:space="preserve">בגלים הבאים כל המסכים יקבלו את אותם מסננים</w:t>
+            </w:r>
+          </w:p>
+        </w:tc>
+      </w:tr>
+      <w:tr>
+        <w:trPr>
+          <w:tblHeader w:val="false"/>
+        </w:trPr>
+        <w:tc>
+          <w:tcPr>
+            <w:tcW w:type="dxa" w:w="1070"/>
+            <w:tcBorders>
+              <w:top w:val="single" w:color="BFBFBF" w:sz="4"/>
+              <w:left w:val="single" w:color="BFBFBF" w:sz="4"/>
+              <w:bottom w:val="single" w:color="BFBFBF" w:sz="4"/>
+              <w:right w:val="single" w:color="BFBFBF" w:sz="4"/>
+            </w:tcBorders>
+            <w:tcMar>
+              <w:top w:type="dxa" w:w="60"/>
+              <w:left w:type="dxa" w:w="100"/>
+              <w:bottom w:type="dxa" w:w="60"/>
+              <w:right w:type="dxa" w:w="100"/>
+            </w:tcMar>
+          </w:tcPr>
+          <w:p>
+            <w:pPr>
+              <w:bidi/>
+              <w:spacing w:after="0"/>
+            </w:pPr>
+            <w:r>
+              <w:rPr>
+                <w:rFonts w:ascii="Arial" w:cs="Arial" w:eastAsia="Arial" w:hAnsi="Arial"/>
+                <w:b/>
+                <w:bCs/>
+                <w:sz w:val="19"/>
+                <w:szCs w:val="19"/>
+                <w:rtl/>
+              </w:rPr>
+              <w:t xml:space="preserve">ייצוא</w:t>
+            </w:r>
+          </w:p>
+        </w:tc>
+        <w:tc>
+          <w:tcPr>
+            <w:tcW w:type="dxa" w:w="4285"/>
+            <w:tcBorders>
+              <w:top w:val="single" w:color="BFBFBF" w:sz="4"/>
+              <w:left w:val="single" w:color="BFBFBF" w:sz="4"/>
+              <w:bottom w:val="single" w:color="BFBFBF" w:sz="4"/>
+              <w:right w:val="single" w:color="BFBFBF" w:sz="4"/>
+            </w:tcBorders>
+            <w:tcMar>
+              <w:top w:type="dxa" w:w="60"/>
+              <w:left w:type="dxa" w:w="100"/>
+              <w:bottom w:type="dxa" w:w="60"/>
+              <w:right w:type="dxa" w:w="100"/>
+            </w:tcMar>
+          </w:tcPr>
+          <w:p>
+            <w:pPr>
+              <w:bidi/>
+              <w:spacing w:after="0"/>
+            </w:pPr>
+            <w:r>
+              <w:rPr>
+                <w:rFonts w:ascii="Arial" w:cs="Arial" w:eastAsia="Arial" w:hAnsi="Arial"/>
+                <w:sz w:val="19"/>
+                <w:szCs w:val="19"/>
+                <w:rtl/>
+              </w:rPr>
+              <w:t xml:space="preserve">ייצוא CSV מכל טבלה, עם audit log, ורק של השדות שמוצגים במסך</w:t>
+            </w:r>
+          </w:p>
+        </w:tc>
+        <w:tc>
+          <w:tcPr>
+            <w:tcW w:type="dxa" w:w="4283"/>
+            <w:tcBorders>
+              <w:top w:val="single" w:color="BFBFBF" w:sz="4"/>
+              <w:left w:val="single" w:color="BFBFBF" w:sz="4"/>
+              <w:bottom w:val="single" w:color="BFBFBF" w:sz="4"/>
+              <w:right w:val="single" w:color="BFBFBF" w:sz="4"/>
+            </w:tcBorders>
+            <w:tcMar>
+              <w:top w:type="dxa" w:w="60"/>
+              <w:left w:type="dxa" w:w="100"/>
+              <w:bottom w:type="dxa" w:w="60"/>
+              <w:right w:type="dxa" w:w="100"/>
+            </w:tcMar>
+          </w:tcPr>
+          <w:p>
+            <w:pPr>
+              <w:bidi/>
+              <w:spacing w:after="0"/>
+            </w:pPr>
+            <w:r>
+              <w:rPr>
+                <w:rFonts w:ascii="Arial" w:cs="Arial" w:eastAsia="Arial" w:hAnsi="Arial"/>
+                <w:sz w:val="19"/>
+                <w:szCs w:val="19"/>
+                <w:rtl/>
+              </w:rPr>
+              <w:t xml:space="preserve">מענה לשאלות חד-פעמיות, בלי שהנתונים "מתפזרים" בקבצים לא מבוקרים</w:t>
+            </w:r>
+          </w:p>
+        </w:tc>
+      </w:tr>
+      <w:tr>
+        <w:trPr>
+          <w:tblHeader w:val="false"/>
+        </w:trPr>
+        <w:tc>
+          <w:tcPr>
+            <w:tcW w:type="dxa" w:w="1070"/>
+            <w:tcBorders>
+              <w:top w:val="single" w:color="BFBFBF" w:sz="4"/>
+              <w:left w:val="single" w:color="BFBFBF" w:sz="4"/>
+              <w:bottom w:val="single" w:color="BFBFBF" w:sz="4"/>
+              <w:right w:val="single" w:color="BFBFBF" w:sz="4"/>
+            </w:tcBorders>
+            <w:tcMar>
+              <w:top w:type="dxa" w:w="60"/>
+              <w:left w:type="dxa" w:w="100"/>
+              <w:bottom w:type="dxa" w:w="60"/>
+              <w:right w:type="dxa" w:w="100"/>
+            </w:tcMar>
+          </w:tcPr>
+          <w:p>
+            <w:pPr>
+              <w:bidi/>
+              <w:spacing w:after="0"/>
+            </w:pPr>
+            <w:r>
+              <w:rPr>
+                <w:rFonts w:ascii="Arial" w:cs="Arial" w:eastAsia="Arial" w:hAnsi="Arial"/>
+                <w:b/>
+                <w:bCs/>
+                <w:sz w:val="19"/>
+                <w:szCs w:val="19"/>
+                <w:rtl/>
+              </w:rPr>
+              <w:t xml:space="preserve">היסטוריה</w:t>
+            </w:r>
+          </w:p>
+        </w:tc>
+        <w:tc>
+          <w:tcPr>
+            <w:tcW w:type="dxa" w:w="4285"/>
+            <w:tcBorders>
+              <w:top w:val="single" w:color="BFBFBF" w:sz="4"/>
+              <w:left w:val="single" w:color="BFBFBF" w:sz="4"/>
+              <w:bottom w:val="single" w:color="BFBFBF" w:sz="4"/>
+              <w:right w:val="single" w:color="BFBFBF" w:sz="4"/>
+            </w:tcBorders>
+            <w:tcMar>
+              <w:top w:type="dxa" w:w="60"/>
+              <w:left w:type="dxa" w:w="100"/>
+              <w:bottom w:type="dxa" w:w="60"/>
+              <w:right w:type="dxa" w:w="100"/>
+            </w:tcMar>
+          </w:tcPr>
+          <w:p>
+            <w:pPr>
+              <w:bidi/>
+              <w:spacing w:after="0"/>
+            </w:pPr>
+            <w:r>
+              <w:rPr>
+                <w:rFonts w:ascii="Arial" w:cs="Arial" w:eastAsia="Arial" w:hAnsi="Arial"/>
+                <w:sz w:val="19"/>
+                <w:szCs w:val="19"/>
+                <w:rtl/>
+              </w:rPr>
+              <w:t xml:space="preserve">שמירת היסטוריית השדות של Case ו-Request ב-DW מתחילה עכשיו, למרות שה-MVP לא משתמש בה</w:t>
+            </w:r>
+          </w:p>
+        </w:tc>
+        <w:tc>
+          <w:tcPr>
+            <w:tcW w:type="dxa" w:w="4283"/>
+            <w:tcBorders>
+              <w:top w:val="single" w:color="BFBFBF" w:sz="4"/>
+              <w:left w:val="single" w:color="BFBFBF" w:sz="4"/>
+              <w:bottom w:val="single" w:color="BFBFBF" w:sz="4"/>
+              <w:right w:val="single" w:color="BFBFBF" w:sz="4"/>
+            </w:tcBorders>
+            <w:tcMar>
+              <w:top w:type="dxa" w:w="60"/>
+              <w:left w:type="dxa" w:w="100"/>
+              <w:bottom w:type="dxa" w:w="60"/>
+              <w:right w:type="dxa" w:w="100"/>
+            </w:tcMar>
+          </w:tcPr>
+          <w:p>
+            <w:pPr>
+              <w:bidi/>
+              <w:spacing w:after="0"/>
+            </w:pPr>
+            <w:r>
+              <w:rPr>
+                <w:rFonts w:ascii="Arial" w:cs="Arial" w:eastAsia="Arial" w:hAnsi="Arial"/>
+                <w:sz w:val="19"/>
+                <w:szCs w:val="19"/>
+                <w:rtl/>
+              </w:rPr>
+              <w:t xml:space="preserve">כל הגל האנליטי תלוי בה, ו-Salesforce מוחקת אותה אחרי כ-18 חודשים</w:t>
+            </w:r>
+          </w:p>
+        </w:tc>
+      </w:tr>
+    </w:tbl>
+    <w:p>
+      <w:pPr>
+        <w:spacing w:after="120"/>
+      </w:pPr>
+    </w:p>
+    <w:p>
+      <w:pPr>
         <w:pStyle w:val="Heading1"/>
         <w:bidi/>
       </w:pPr>
@@ -7197,9 +8151,9 @@
         <w:tblLayout w:type="fixed"/>
       </w:tblPr>
       <w:tblGrid>
-        <w:gridCol w:w="4029"/>
-        <w:gridCol w:w="3555"/>
-        <w:gridCol w:w="2054"/>
+        <w:gridCol w:w="2943"/>
+        <w:gridCol w:w="3231"/>
+        <w:gridCol w:w="3464"/>
       </w:tblGrid>
       <w:tr>
         <w:trPr>
@@ -7207,7 +8161,7 @@
         </w:trPr>
         <w:tc>
           <w:tcPr>
-            <w:tcW w:type="dxa" w:w="4029"/>
+            <w:tcW w:type="dxa" w:w="2943"/>
             <w:tcBorders>
               <w:top w:val="single" w:color="BFBFBF" w:sz="4"/>
               <w:left w:val="single" w:color="BFBFBF" w:sz="4"/>
@@ -7242,7 +8196,7 @@
         </w:tc>
         <w:tc>
           <w:tcPr>
-            <w:tcW w:type="dxa" w:w="3555"/>
+            <w:tcW w:type="dxa" w:w="3231"/>
             <w:tcBorders>
               <w:top w:val="single" w:color="BFBFBF" w:sz="4"/>
               <w:left w:val="single" w:color="BFBFBF" w:sz="4"/>
@@ -7277,7 +8231,7 @@
         </w:tc>
         <w:tc>
           <w:tcPr>
-            <w:tcW w:type="dxa" w:w="2054"/>
+            <w:tcW w:type="dxa" w:w="3464"/>
             <w:tcBorders>
               <w:top w:val="single" w:color="BFBFBF" w:sz="4"/>
               <w:left w:val="single" w:color="BFBFBF" w:sz="4"/>
@@ -7317,7 +8271,7 @@
         </w:trPr>
         <w:tc>
           <w:tcPr>
-            <w:tcW w:type="dxa" w:w="4029"/>
+            <w:tcW w:type="dxa" w:w="2943"/>
             <w:tcBorders>
               <w:top w:val="single" w:color="BFBFBF" w:sz="4"/>
               <w:left w:val="single" w:color="BFBFBF" w:sz="4"/>
@@ -7349,7 +8303,7 @@
         </w:tc>
         <w:tc>
           <w:tcPr>
-            <w:tcW w:type="dxa" w:w="3555"/>
+            <w:tcW w:type="dxa" w:w="3231"/>
             <w:tcBorders>
               <w:top w:val="single" w:color="BFBFBF" w:sz="4"/>
               <w:left w:val="single" w:color="BFBFBF" w:sz="4"/>
@@ -7381,7 +8335,7 @@
         </w:tc>
         <w:tc>
           <w:tcPr>
-            <w:tcW w:type="dxa" w:w="2054"/>
+            <w:tcW w:type="dxa" w:w="3464"/>
             <w:tcBorders>
               <w:top w:val="single" w:color="BFBFBF" w:sz="4"/>
               <w:left w:val="single" w:color="BFBFBF" w:sz="4"/>
@@ -7418,7 +8372,7 @@
         </w:trPr>
         <w:tc>
           <w:tcPr>
-            <w:tcW w:type="dxa" w:w="4029"/>
+            <w:tcW w:type="dxa" w:w="2943"/>
             <w:tcBorders>
               <w:top w:val="single" w:color="BFBFBF" w:sz="4"/>
               <w:left w:val="single" w:color="BFBFBF" w:sz="4"/>
@@ -7450,7 +8404,7 @@
         </w:tc>
         <w:tc>
           <w:tcPr>
-            <w:tcW w:type="dxa" w:w="3555"/>
+            <w:tcW w:type="dxa" w:w="3231"/>
             <w:tcBorders>
               <w:top w:val="single" w:color="BFBFBF" w:sz="4"/>
               <w:left w:val="single" w:color="BFBFBF" w:sz="4"/>
@@ -7482,7 +8436,7 @@
         </w:tc>
         <w:tc>
           <w:tcPr>
-            <w:tcW w:type="dxa" w:w="2054"/>
+            <w:tcW w:type="dxa" w:w="3464"/>
             <w:tcBorders>
               <w:top w:val="single" w:color="BFBFBF" w:sz="4"/>
               <w:left w:val="single" w:color="BFBFBF" w:sz="4"/>
@@ -7519,7 +8473,7 @@
         </w:trPr>
         <w:tc>
           <w:tcPr>
-            <w:tcW w:type="dxa" w:w="4029"/>
+            <w:tcW w:type="dxa" w:w="2943"/>
             <w:tcBorders>
               <w:top w:val="single" w:color="BFBFBF" w:sz="4"/>
               <w:left w:val="single" w:color="BFBFBF" w:sz="4"/>
@@ -7551,7 +8505,7 @@
         </w:tc>
         <w:tc>
           <w:tcPr>
-            <w:tcW w:type="dxa" w:w="3555"/>
+            <w:tcW w:type="dxa" w:w="3231"/>
             <w:tcBorders>
               <w:top w:val="single" w:color="BFBFBF" w:sz="4"/>
               <w:left w:val="single" w:color="BFBFBF" w:sz="4"/>
@@ -7583,7 +8537,7 @@
         </w:tc>
         <w:tc>
           <w:tcPr>
-            <w:tcW w:type="dxa" w:w="2054"/>
+            <w:tcW w:type="dxa" w:w="3464"/>
             <w:tcBorders>
               <w:top w:val="single" w:color="BFBFBF" w:sz="4"/>
               <w:left w:val="single" w:color="BFBFBF" w:sz="4"/>
@@ -7620,7 +8574,7 @@
         </w:trPr>
         <w:tc>
           <w:tcPr>
-            <w:tcW w:type="dxa" w:w="4029"/>
+            <w:tcW w:type="dxa" w:w="2943"/>
             <w:tcBorders>
               <w:top w:val="single" w:color="BFBFBF" w:sz="4"/>
               <w:left w:val="single" w:color="BFBFBF" w:sz="4"/>
@@ -7652,7 +8606,7 @@
         </w:tc>
         <w:tc>
           <w:tcPr>
-            <w:tcW w:type="dxa" w:w="3555"/>
+            <w:tcW w:type="dxa" w:w="3231"/>
             <w:tcBorders>
               <w:top w:val="single" w:color="BFBFBF" w:sz="4"/>
               <w:left w:val="single" w:color="BFBFBF" w:sz="4"/>
@@ -7684,7 +8638,7 @@
         </w:tc>
         <w:tc>
           <w:tcPr>
-            <w:tcW w:type="dxa" w:w="2054"/>
+            <w:tcW w:type="dxa" w:w="3464"/>
             <w:tcBorders>
               <w:top w:val="single" w:color="BFBFBF" w:sz="4"/>
               <w:left w:val="single" w:color="BFBFBF" w:sz="4"/>
@@ -7721,7 +8675,7 @@
         </w:trPr>
         <w:tc>
           <w:tcPr>
-            <w:tcW w:type="dxa" w:w="4029"/>
+            <w:tcW w:type="dxa" w:w="2943"/>
             <w:tcBorders>
               <w:top w:val="single" w:color="BFBFBF" w:sz="4"/>
               <w:left w:val="single" w:color="BFBFBF" w:sz="4"/>
@@ -7755,39 +8709,39 @@
         </w:tc>
         <w:tc>
           <w:tcPr>
-            <w:tcW w:type="dxa" w:w="3555"/>
-            <w:tcBorders>
-              <w:top w:val="single" w:color="BFBFBF" w:sz="4"/>
-              <w:left w:val="single" w:color="BFBFBF" w:sz="4"/>
-              <w:bottom w:val="single" w:color="BFBFBF" w:sz="4"/>
-              <w:right w:val="single" w:color="BFBFBF" w:sz="4"/>
-            </w:tcBorders>
-            <w:tcMar>
-              <w:top w:type="dxa" w:w="60"/>
-              <w:left w:type="dxa" w:w="100"/>
-              <w:bottom w:type="dxa" w:w="60"/>
-              <w:right w:type="dxa" w:w="100"/>
-            </w:tcMar>
-          </w:tcPr>
-          <w:p>
-            <w:pPr>
-              <w:bidi/>
-              <w:spacing w:after="0"/>
-            </w:pPr>
-            <w:r>
-              <w:rPr>
-                <w:rFonts w:ascii="Arial" w:cs="Arial" w:eastAsia="Arial" w:hAnsi="Arial"/>
-                <w:sz w:val="19"/>
-                <w:szCs w:val="19"/>
-                <w:rtl/>
-              </w:rPr>
-              <w:t xml:space="preserve">תיקונים, עדכוני ספריות ואבטחה, ושינויים קטנים</w:t>
-            </w:r>
-          </w:p>
-        </w:tc>
-        <w:tc>
-          <w:tcPr>
-            <w:tcW w:type="dxa" w:w="2054"/>
+            <w:tcW w:type="dxa" w:w="3231"/>
+            <w:tcBorders>
+              <w:top w:val="single" w:color="BFBFBF" w:sz="4"/>
+              <w:left w:val="single" w:color="BFBFBF" w:sz="4"/>
+              <w:bottom w:val="single" w:color="BFBFBF" w:sz="4"/>
+              <w:right w:val="single" w:color="BFBFBF" w:sz="4"/>
+            </w:tcBorders>
+            <w:tcMar>
+              <w:top w:type="dxa" w:w="60"/>
+              <w:left w:type="dxa" w:w="100"/>
+              <w:bottom w:type="dxa" w:w="60"/>
+              <w:right w:type="dxa" w:w="100"/>
+            </w:tcMar>
+          </w:tcPr>
+          <w:p>
+            <w:pPr>
+              <w:bidi/>
+              <w:spacing w:after="0"/>
+            </w:pPr>
+            <w:r>
+              <w:rPr>
+                <w:rFonts w:ascii="Arial" w:cs="Arial" w:eastAsia="Arial" w:hAnsi="Arial"/>
+                <w:sz w:val="19"/>
+                <w:szCs w:val="19"/>
+                <w:rtl/>
+              </w:rPr>
+              <w:t xml:space="preserve">מפתח ו-DBA: תיקונים, עדכוני ספריות ואבטחה, שינויים קטנים</w:t>
+            </w:r>
+          </w:p>
+        </w:tc>
+        <w:tc>
+          <w:tcPr>
+            <w:tcW w:type="dxa" w:w="3464"/>
             <w:tcBorders>
               <w:top w:val="single" w:color="BFBFBF" w:sz="4"/>
               <w:left w:val="single" w:color="BFBFBF" w:sz="4"/>
@@ -7815,7 +8769,16 @@
                 <w:szCs w:val="19"/>
                 <w:rtl/>
               </w:rPr>
-              <w:t xml:space="preserve">כ-0.2-0.3 משרה, באופן קבוע</w:t>
+              <w:t xml:space="preserve">כ-0.2-0.3 משרת מפתח וכ-0.1 משרת DBA, באופן קבוע</w:t>
+            </w:r>
+            <w:r>
+              <w:rPr>
+                <w:rFonts w:ascii="Arial" w:cs="Arial" w:eastAsia="Arial" w:hAnsi="Arial"/>
+                <w:sz w:val="19"/>
+                <w:szCs w:val="19"/>
+                <w:rtl/>
+              </w:rPr>
+              <w:t xml:space="preserve"> (לא כולל פיתוח הגלים האנליטיים, ראו 7.4)</w:t>
             </w:r>
           </w:p>
         </w:tc>
@@ -7860,6 +8823,1558 @@
     </w:p>
     <w:p>
       <w:pPr>
+        <w:pStyle w:val="Heading2"/>
+        <w:bidi/>
+      </w:pPr>
+      <w:r>
+        <w:rPr>
+          <w:rFonts w:ascii="Arial" w:cs="Arial" w:eastAsia="Arial" w:hAnsi="Arial"/>
+          <w:rtl/>
+        </w:rPr>
+        <w:t xml:space="preserve">7.4 מפת דרכים: הגלים האנליטיים בפיתוח פנימי</w:t>
+      </w:r>
+    </w:p>
+    <w:p>
+      <w:pPr>
+        <w:bidi/>
+        <w:spacing w:after="120" w:line="276"/>
+        <w:jc w:val="start"/>
+      </w:pPr>
+      <w:r>
+        <w:rPr>
+          <w:rFonts w:ascii="Arial" w:cs="Arial" w:eastAsia="Arial" w:hAnsi="Arial"/>
+          <w:rtl/>
+        </w:rPr>
+        <w:t xml:space="preserve">ההערכות כאן גסות, ונועדו לתכנון קיבולת בלבד. כל גל יקבל אפיון והערכה משלו לפני שמתחילים אותו.</w:t>
+      </w:r>
+    </w:p>
+    <w:tbl>
+      <w:tblPr>
+        <w:bidiVisual/>
+        <w:tblW w:type="dxa" w:w="9638"/>
+        <w:tblBorders>
+          <w:top w:val="single" w:color="auto" w:sz="4"/>
+          <w:left w:val="single" w:color="auto" w:sz="4"/>
+          <w:bottom w:val="single" w:color="auto" w:sz="4"/>
+          <w:right w:val="single" w:color="auto" w:sz="4"/>
+          <w:insideH w:val="single" w:color="auto" w:sz="4"/>
+          <w:insideV w:val="single" w:color="auto" w:sz="4"/>
+        </w:tblBorders>
+        <w:tblLayout w:type="fixed"/>
+      </w:tblPr>
+      <w:tblGrid>
+        <w:gridCol w:w="950"/>
+        <w:gridCol w:w="4766"/>
+        <w:gridCol w:w="2217"/>
+        <w:gridCol w:w="1705"/>
+      </w:tblGrid>
+      <w:tr>
+        <w:trPr>
+          <w:tblHeader/>
+        </w:trPr>
+        <w:tc>
+          <w:tcPr>
+            <w:tcW w:type="dxa" w:w="950"/>
+            <w:tcBorders>
+              <w:top w:val="single" w:color="BFBFBF" w:sz="4"/>
+              <w:left w:val="single" w:color="BFBFBF" w:sz="4"/>
+              <w:bottom w:val="single" w:color="BFBFBF" w:sz="4"/>
+              <w:right w:val="single" w:color="BFBFBF" w:sz="4"/>
+            </w:tcBorders>
+            <w:shd w:fill="DCE6F1" w:color="auto" w:val="clear"/>
+            <w:tcMar>
+              <w:top w:type="dxa" w:w="60"/>
+              <w:left w:type="dxa" w:w="100"/>
+              <w:bottom w:type="dxa" w:w="60"/>
+              <w:right w:type="dxa" w:w="100"/>
+            </w:tcMar>
+          </w:tcPr>
+          <w:p>
+            <w:pPr>
+              <w:bidi/>
+              <w:spacing w:after="0"/>
+            </w:pPr>
+            <w:r>
+              <w:rPr>
+                <w:rFonts w:ascii="Arial" w:cs="Arial" w:eastAsia="Arial" w:hAnsi="Arial"/>
+                <w:b/>
+                <w:bCs/>
+                <w:sz w:val="19"/>
+                <w:szCs w:val="19"/>
+                <w:rtl/>
+              </w:rPr>
+              <w:t xml:space="preserve">גל</w:t>
+            </w:r>
+          </w:p>
+        </w:tc>
+        <w:tc>
+          <w:tcPr>
+            <w:tcW w:type="dxa" w:w="4766"/>
+            <w:tcBorders>
+              <w:top w:val="single" w:color="BFBFBF" w:sz="4"/>
+              <w:left w:val="single" w:color="BFBFBF" w:sz="4"/>
+              <w:bottom w:val="single" w:color="BFBFBF" w:sz="4"/>
+              <w:right w:val="single" w:color="BFBFBF" w:sz="4"/>
+            </w:tcBorders>
+            <w:shd w:fill="DCE6F1" w:color="auto" w:val="clear"/>
+            <w:tcMar>
+              <w:top w:type="dxa" w:w="60"/>
+              <w:left w:type="dxa" w:w="100"/>
+              <w:bottom w:type="dxa" w:w="60"/>
+              <w:right w:type="dxa" w:w="100"/>
+            </w:tcMar>
+          </w:tcPr>
+          <w:p>
+            <w:pPr>
+              <w:bidi/>
+              <w:spacing w:after="0"/>
+            </w:pPr>
+            <w:r>
+              <w:rPr>
+                <w:rFonts w:ascii="Arial" w:cs="Arial" w:eastAsia="Arial" w:hAnsi="Arial"/>
+                <w:b/>
+                <w:bCs/>
+                <w:sz w:val="19"/>
+                <w:szCs w:val="19"/>
+                <w:rtl/>
+              </w:rPr>
+              <w:t xml:space="preserve">תוכן</w:t>
+            </w:r>
+          </w:p>
+        </w:tc>
+        <w:tc>
+          <w:tcPr>
+            <w:tcW w:type="dxa" w:w="2217"/>
+            <w:tcBorders>
+              <w:top w:val="single" w:color="BFBFBF" w:sz="4"/>
+              <w:left w:val="single" w:color="BFBFBF" w:sz="4"/>
+              <w:bottom w:val="single" w:color="BFBFBF" w:sz="4"/>
+              <w:right w:val="single" w:color="BFBFBF" w:sz="4"/>
+            </w:tcBorders>
+            <w:shd w:fill="DCE6F1" w:color="auto" w:val="clear"/>
+            <w:tcMar>
+              <w:top w:type="dxa" w:w="60"/>
+              <w:left w:type="dxa" w:w="100"/>
+              <w:bottom w:type="dxa" w:w="60"/>
+              <w:right w:type="dxa" w:w="100"/>
+            </w:tcMar>
+          </w:tcPr>
+          <w:p>
+            <w:pPr>
+              <w:bidi/>
+              <w:spacing w:after="0"/>
+            </w:pPr>
+            <w:r>
+              <w:rPr>
+                <w:rFonts w:ascii="Arial" w:cs="Arial" w:eastAsia="Arial" w:hAnsi="Arial"/>
+                <w:b/>
+                <w:bCs/>
+                <w:sz w:val="19"/>
+                <w:szCs w:val="19"/>
+                <w:rtl/>
+              </w:rPr>
+              <w:t xml:space="preserve">הערכה (שבועות-מפתח)</w:t>
+            </w:r>
+          </w:p>
+        </w:tc>
+        <w:tc>
+          <w:tcPr>
+            <w:tcW w:type="dxa" w:w="1705"/>
+            <w:tcBorders>
+              <w:top w:val="single" w:color="BFBFBF" w:sz="4"/>
+              <w:left w:val="single" w:color="BFBFBF" w:sz="4"/>
+              <w:bottom w:val="single" w:color="BFBFBF" w:sz="4"/>
+              <w:right w:val="single" w:color="BFBFBF" w:sz="4"/>
+            </w:tcBorders>
+            <w:shd w:fill="DCE6F1" w:color="auto" w:val="clear"/>
+            <w:tcMar>
+              <w:top w:type="dxa" w:w="60"/>
+              <w:left w:type="dxa" w:w="100"/>
+              <w:bottom w:type="dxa" w:w="60"/>
+              <w:right w:type="dxa" w:w="100"/>
+            </w:tcMar>
+          </w:tcPr>
+          <w:p>
+            <w:pPr>
+              <w:bidi/>
+              <w:spacing w:after="0"/>
+            </w:pPr>
+            <w:r>
+              <w:rPr>
+                <w:rFonts w:ascii="Arial" w:cs="Arial" w:eastAsia="Arial" w:hAnsi="Arial"/>
+                <w:b/>
+                <w:bCs/>
+                <w:sz w:val="19"/>
+                <w:szCs w:val="19"/>
+                <w:rtl/>
+              </w:rPr>
+              <w:t xml:space="preserve">הערכה (שבועות-DBA)</w:t>
+            </w:r>
+          </w:p>
+        </w:tc>
+      </w:tr>
+      <w:tr>
+        <w:trPr>
+          <w:tblHeader w:val="false"/>
+        </w:trPr>
+        <w:tc>
+          <w:tcPr>
+            <w:tcW w:type="dxa" w:w="950"/>
+            <w:tcBorders>
+              <w:top w:val="single" w:color="BFBFBF" w:sz="4"/>
+              <w:left w:val="single" w:color="BFBFBF" w:sz="4"/>
+              <w:bottom w:val="single" w:color="BFBFBF" w:sz="4"/>
+              <w:right w:val="single" w:color="BFBFBF" w:sz="4"/>
+            </w:tcBorders>
+            <w:tcMar>
+              <w:top w:type="dxa" w:w="60"/>
+              <w:left w:type="dxa" w:w="100"/>
+              <w:bottom w:type="dxa" w:w="60"/>
+              <w:right w:type="dxa" w:w="100"/>
+            </w:tcMar>
+          </w:tcPr>
+          <w:p>
+            <w:pPr>
+              <w:bidi/>
+              <w:spacing w:after="0"/>
+            </w:pPr>
+            <w:r>
+              <w:rPr>
+                <w:rFonts w:ascii="Arial" w:cs="Arial" w:eastAsia="Arial" w:hAnsi="Arial"/>
+                <w:sz w:val="19"/>
+                <w:szCs w:val="19"/>
+                <w:rtl/>
+              </w:rPr>
+              <w:t xml:space="preserve">2א</w:t>
+            </w:r>
+          </w:p>
+        </w:tc>
+        <w:tc>
+          <w:tcPr>
+            <w:tcW w:type="dxa" w:w="4766"/>
+            <w:tcBorders>
+              <w:top w:val="single" w:color="BFBFBF" w:sz="4"/>
+              <w:left w:val="single" w:color="BFBFBF" w:sz="4"/>
+              <w:bottom w:val="single" w:color="BFBFBF" w:sz="4"/>
+              <w:right w:val="single" w:color="BFBFBF" w:sz="4"/>
+            </w:tcBorders>
+            <w:tcMar>
+              <w:top w:type="dxa" w:w="60"/>
+              <w:left w:type="dxa" w:w="100"/>
+              <w:bottom w:type="dxa" w:w="60"/>
+              <w:right w:type="dxa" w:w="100"/>
+            </w:tcMar>
+          </w:tcPr>
+          <w:p>
+            <w:pPr>
+              <w:bidi/>
+              <w:spacing w:after="0"/>
+            </w:pPr>
+            <w:r>
+              <w:rPr>
+                <w:rFonts w:ascii="Arial" w:cs="Arial" w:eastAsia="Arial" w:hAnsi="Arial"/>
+                <w:sz w:val="19"/>
+                <w:szCs w:val="19"/>
+                <w:rtl/>
+              </w:rPr>
+              <w:t xml:space="preserve">שכבת היסטוריה ומדדים: פרקי זמן בכל סטטוס ובכל טיר, Assets, Case Type</w:t>
+            </w:r>
+          </w:p>
+        </w:tc>
+        <w:tc>
+          <w:tcPr>
+            <w:tcW w:type="dxa" w:w="2217"/>
+            <w:tcBorders>
+              <w:top w:val="single" w:color="BFBFBF" w:sz="4"/>
+              <w:left w:val="single" w:color="BFBFBF" w:sz="4"/>
+              <w:bottom w:val="single" w:color="BFBFBF" w:sz="4"/>
+              <w:right w:val="single" w:color="BFBFBF" w:sz="4"/>
+            </w:tcBorders>
+            <w:tcMar>
+              <w:top w:type="dxa" w:w="60"/>
+              <w:left w:type="dxa" w:w="100"/>
+              <w:bottom w:type="dxa" w:w="60"/>
+              <w:right w:type="dxa" w:w="100"/>
+            </w:tcMar>
+          </w:tcPr>
+          <w:p>
+            <w:pPr>
+              <w:bidi/>
+              <w:spacing w:after="0"/>
+            </w:pPr>
+            <w:r>
+              <w:rPr>
+                <w:rFonts w:ascii="Arial" w:cs="Arial" w:eastAsia="Arial" w:hAnsi="Arial"/>
+                <w:sz w:val="19"/>
+                <w:szCs w:val="19"/>
+                <w:rtl/>
+              </w:rPr>
+              <w:t xml:space="preserve">1</w:t>
+            </w:r>
+          </w:p>
+        </w:tc>
+        <w:tc>
+          <w:tcPr>
+            <w:tcW w:type="dxa" w:w="1705"/>
+            <w:tcBorders>
+              <w:top w:val="single" w:color="BFBFBF" w:sz="4"/>
+              <w:left w:val="single" w:color="BFBFBF" w:sz="4"/>
+              <w:bottom w:val="single" w:color="BFBFBF" w:sz="4"/>
+              <w:right w:val="single" w:color="BFBFBF" w:sz="4"/>
+            </w:tcBorders>
+            <w:tcMar>
+              <w:top w:type="dxa" w:w="60"/>
+              <w:left w:type="dxa" w:w="100"/>
+              <w:bottom w:type="dxa" w:w="60"/>
+              <w:right w:type="dxa" w:w="100"/>
+            </w:tcMar>
+          </w:tcPr>
+          <w:p>
+            <w:pPr>
+              <w:bidi/>
+              <w:spacing w:after="0"/>
+            </w:pPr>
+            <w:r>
+              <w:rPr>
+                <w:rFonts w:ascii="Arial" w:cs="Arial" w:eastAsia="Arial" w:hAnsi="Arial"/>
+                <w:sz w:val="19"/>
+                <w:szCs w:val="19"/>
+                <w:rtl/>
+              </w:rPr>
+              <w:t xml:space="preserve">3-4</w:t>
+            </w:r>
+          </w:p>
+        </w:tc>
+      </w:tr>
+      <w:tr>
+        <w:trPr>
+          <w:tblHeader w:val="false"/>
+        </w:trPr>
+        <w:tc>
+          <w:tcPr>
+            <w:tcW w:type="dxa" w:w="950"/>
+            <w:tcBorders>
+              <w:top w:val="single" w:color="BFBFBF" w:sz="4"/>
+              <w:left w:val="single" w:color="BFBFBF" w:sz="4"/>
+              <w:bottom w:val="single" w:color="BFBFBF" w:sz="4"/>
+              <w:right w:val="single" w:color="BFBFBF" w:sz="4"/>
+            </w:tcBorders>
+            <w:tcMar>
+              <w:top w:type="dxa" w:w="60"/>
+              <w:left w:type="dxa" w:w="100"/>
+              <w:bottom w:type="dxa" w:w="60"/>
+              <w:right w:type="dxa" w:w="100"/>
+            </w:tcMar>
+          </w:tcPr>
+          <w:p>
+            <w:pPr>
+              <w:bidi/>
+              <w:spacing w:after="0"/>
+            </w:pPr>
+            <w:r>
+              <w:rPr>
+                <w:rFonts w:ascii="Arial" w:cs="Arial" w:eastAsia="Arial" w:hAnsi="Arial"/>
+                <w:sz w:val="19"/>
+                <w:szCs w:val="19"/>
+                <w:rtl/>
+              </w:rPr>
+              <w:t xml:space="preserve">2ב</w:t>
+            </w:r>
+          </w:p>
+        </w:tc>
+        <w:tc>
+          <w:tcPr>
+            <w:tcW w:type="dxa" w:w="4766"/>
+            <w:tcBorders>
+              <w:top w:val="single" w:color="BFBFBF" w:sz="4"/>
+              <w:left w:val="single" w:color="BFBFBF" w:sz="4"/>
+              <w:bottom w:val="single" w:color="BFBFBF" w:sz="4"/>
+              <w:right w:val="single" w:color="BFBFBF" w:sz="4"/>
+            </w:tcBorders>
+            <w:tcMar>
+              <w:top w:type="dxa" w:w="60"/>
+              <w:left w:type="dxa" w:w="100"/>
+              <w:bottom w:type="dxa" w:w="60"/>
+              <w:right w:type="dxa" w:w="100"/>
+            </w:tcMar>
+          </w:tcPr>
+          <w:p>
+            <w:pPr>
+              <w:bidi/>
+              <w:spacing w:after="0"/>
+            </w:pPr>
+            <w:r>
+              <w:rPr>
+                <w:rFonts w:ascii="Arial" w:cs="Arial" w:eastAsia="Arial" w:hAnsi="Arial"/>
+                <w:sz w:val="19"/>
+                <w:szCs w:val="19"/>
+                <w:rtl/>
+              </w:rPr>
+              <w:t xml:space="preserve">עומס והספק: עומס משוקלל לסוכן, FCR, אסקלציה, עבודה לפי Case Type</w:t>
+            </w:r>
+          </w:p>
+        </w:tc>
+        <w:tc>
+          <w:tcPr>
+            <w:tcW w:type="dxa" w:w="2217"/>
+            <w:tcBorders>
+              <w:top w:val="single" w:color="BFBFBF" w:sz="4"/>
+              <w:left w:val="single" w:color="BFBFBF" w:sz="4"/>
+              <w:bottom w:val="single" w:color="BFBFBF" w:sz="4"/>
+              <w:right w:val="single" w:color="BFBFBF" w:sz="4"/>
+            </w:tcBorders>
+            <w:tcMar>
+              <w:top w:type="dxa" w:w="60"/>
+              <w:left w:type="dxa" w:w="100"/>
+              <w:bottom w:type="dxa" w:w="60"/>
+              <w:right w:type="dxa" w:w="100"/>
+            </w:tcMar>
+          </w:tcPr>
+          <w:p>
+            <w:pPr>
+              <w:bidi/>
+              <w:spacing w:after="0"/>
+            </w:pPr>
+            <w:r>
+              <w:rPr>
+                <w:rFonts w:ascii="Arial" w:cs="Arial" w:eastAsia="Arial" w:hAnsi="Arial"/>
+                <w:sz w:val="19"/>
+                <w:szCs w:val="19"/>
+                <w:rtl/>
+              </w:rPr>
+              <w:t xml:space="preserve">3-4</w:t>
+            </w:r>
+          </w:p>
+        </w:tc>
+        <w:tc>
+          <w:tcPr>
+            <w:tcW w:type="dxa" w:w="1705"/>
+            <w:tcBorders>
+              <w:top w:val="single" w:color="BFBFBF" w:sz="4"/>
+              <w:left w:val="single" w:color="BFBFBF" w:sz="4"/>
+              <w:bottom w:val="single" w:color="BFBFBF" w:sz="4"/>
+              <w:right w:val="single" w:color="BFBFBF" w:sz="4"/>
+            </w:tcBorders>
+            <w:tcMar>
+              <w:top w:type="dxa" w:w="60"/>
+              <w:left w:type="dxa" w:w="100"/>
+              <w:bottom w:type="dxa" w:w="60"/>
+              <w:right w:type="dxa" w:w="100"/>
+            </w:tcMar>
+          </w:tcPr>
+          <w:p>
+            <w:pPr>
+              <w:bidi/>
+              <w:spacing w:after="0"/>
+            </w:pPr>
+            <w:r>
+              <w:rPr>
+                <w:rFonts w:ascii="Arial" w:cs="Arial" w:eastAsia="Arial" w:hAnsi="Arial"/>
+                <w:sz w:val="19"/>
+                <w:szCs w:val="19"/>
+                <w:rtl/>
+              </w:rPr>
+              <w:t xml:space="preserve">1</w:t>
+            </w:r>
+          </w:p>
+        </w:tc>
+      </w:tr>
+      <w:tr>
+        <w:trPr>
+          <w:tblHeader w:val="false"/>
+        </w:trPr>
+        <w:tc>
+          <w:tcPr>
+            <w:tcW w:type="dxa" w:w="950"/>
+            <w:tcBorders>
+              <w:top w:val="single" w:color="BFBFBF" w:sz="4"/>
+              <w:left w:val="single" w:color="BFBFBF" w:sz="4"/>
+              <w:bottom w:val="single" w:color="BFBFBF" w:sz="4"/>
+              <w:right w:val="single" w:color="BFBFBF" w:sz="4"/>
+            </w:tcBorders>
+            <w:tcMar>
+              <w:top w:type="dxa" w:w="60"/>
+              <w:left w:type="dxa" w:w="100"/>
+              <w:bottom w:type="dxa" w:w="60"/>
+              <w:right w:type="dxa" w:w="100"/>
+            </w:tcMar>
+          </w:tcPr>
+          <w:p>
+            <w:pPr>
+              <w:bidi/>
+              <w:spacing w:after="0"/>
+            </w:pPr>
+            <w:r>
+              <w:rPr>
+                <w:rFonts w:ascii="Arial" w:cs="Arial" w:eastAsia="Arial" w:hAnsi="Arial"/>
+                <w:sz w:val="19"/>
+                <w:szCs w:val="19"/>
+                <w:rtl/>
+              </w:rPr>
+              <w:t xml:space="preserve">2ג</w:t>
+            </w:r>
+          </w:p>
+        </w:tc>
+        <w:tc>
+          <w:tcPr>
+            <w:tcW w:type="dxa" w:w="4766"/>
+            <w:tcBorders>
+              <w:top w:val="single" w:color="BFBFBF" w:sz="4"/>
+              <w:left w:val="single" w:color="BFBFBF" w:sz="4"/>
+              <w:bottom w:val="single" w:color="BFBFBF" w:sz="4"/>
+              <w:right w:val="single" w:color="BFBFBF" w:sz="4"/>
+            </w:tcBorders>
+            <w:tcMar>
+              <w:top w:type="dxa" w:w="60"/>
+              <w:left w:type="dxa" w:w="100"/>
+              <w:bottom w:type="dxa" w:w="60"/>
+              <w:right w:type="dxa" w:w="100"/>
+            </w:tcMar>
+          </w:tcPr>
+          <w:p>
+            <w:pPr>
+              <w:bidi/>
+              <w:spacing w:after="0"/>
+            </w:pPr>
+            <w:r>
+              <w:rPr>
+                <w:rFonts w:ascii="Arial" w:cs="Arial" w:eastAsia="Arial" w:hAnsi="Arial"/>
+                <w:sz w:val="19"/>
+                <w:szCs w:val="19"/>
+                <w:rtl/>
+              </w:rPr>
+              <w:t xml:space="preserve">איכות מוצר: תקלות ל-100 Assets לפי גרסה, באגים מאושרים, דפוסי מוצר</w:t>
+            </w:r>
+          </w:p>
+        </w:tc>
+        <w:tc>
+          <w:tcPr>
+            <w:tcW w:type="dxa" w:w="2217"/>
+            <w:tcBorders>
+              <w:top w:val="single" w:color="BFBFBF" w:sz="4"/>
+              <w:left w:val="single" w:color="BFBFBF" w:sz="4"/>
+              <w:bottom w:val="single" w:color="BFBFBF" w:sz="4"/>
+              <w:right w:val="single" w:color="BFBFBF" w:sz="4"/>
+            </w:tcBorders>
+            <w:tcMar>
+              <w:top w:type="dxa" w:w="60"/>
+              <w:left w:type="dxa" w:w="100"/>
+              <w:bottom w:type="dxa" w:w="60"/>
+              <w:right w:type="dxa" w:w="100"/>
+            </w:tcMar>
+          </w:tcPr>
+          <w:p>
+            <w:pPr>
+              <w:bidi/>
+              <w:spacing w:after="0"/>
+            </w:pPr>
+            <w:r>
+              <w:rPr>
+                <w:rFonts w:ascii="Arial" w:cs="Arial" w:eastAsia="Arial" w:hAnsi="Arial"/>
+                <w:sz w:val="19"/>
+                <w:szCs w:val="19"/>
+                <w:rtl/>
+              </w:rPr>
+              <w:t xml:space="preserve">3-4</w:t>
+            </w:r>
+          </w:p>
+        </w:tc>
+        <w:tc>
+          <w:tcPr>
+            <w:tcW w:type="dxa" w:w="1705"/>
+            <w:tcBorders>
+              <w:top w:val="single" w:color="BFBFBF" w:sz="4"/>
+              <w:left w:val="single" w:color="BFBFBF" w:sz="4"/>
+              <w:bottom w:val="single" w:color="BFBFBF" w:sz="4"/>
+              <w:right w:val="single" w:color="BFBFBF" w:sz="4"/>
+            </w:tcBorders>
+            <w:tcMar>
+              <w:top w:type="dxa" w:w="60"/>
+              <w:left w:type="dxa" w:w="100"/>
+              <w:bottom w:type="dxa" w:w="60"/>
+              <w:right w:type="dxa" w:w="100"/>
+            </w:tcMar>
+          </w:tcPr>
+          <w:p>
+            <w:pPr>
+              <w:bidi/>
+              <w:spacing w:after="0"/>
+            </w:pPr>
+            <w:r>
+              <w:rPr>
+                <w:rFonts w:ascii="Arial" w:cs="Arial" w:eastAsia="Arial" w:hAnsi="Arial"/>
+                <w:sz w:val="19"/>
+                <w:szCs w:val="19"/>
+                <w:rtl/>
+              </w:rPr>
+              <w:t xml:space="preserve">1-2</w:t>
+            </w:r>
+          </w:p>
+        </w:tc>
+      </w:tr>
+      <w:tr>
+        <w:trPr>
+          <w:tblHeader w:val="false"/>
+        </w:trPr>
+        <w:tc>
+          <w:tcPr>
+            <w:tcW w:type="dxa" w:w="950"/>
+            <w:tcBorders>
+              <w:top w:val="single" w:color="BFBFBF" w:sz="4"/>
+              <w:left w:val="single" w:color="BFBFBF" w:sz="4"/>
+              <w:bottom w:val="single" w:color="BFBFBF" w:sz="4"/>
+              <w:right w:val="single" w:color="BFBFBF" w:sz="4"/>
+            </w:tcBorders>
+            <w:tcMar>
+              <w:top w:type="dxa" w:w="60"/>
+              <w:left w:type="dxa" w:w="100"/>
+              <w:bottom w:type="dxa" w:w="60"/>
+              <w:right w:type="dxa" w:w="100"/>
+            </w:tcMar>
+          </w:tcPr>
+          <w:p>
+            <w:pPr>
+              <w:bidi/>
+              <w:spacing w:after="0"/>
+            </w:pPr>
+            <w:r>
+              <w:rPr>
+                <w:rFonts w:ascii="Arial" w:cs="Arial" w:eastAsia="Arial" w:hAnsi="Arial"/>
+                <w:sz w:val="19"/>
+                <w:szCs w:val="19"/>
+                <w:rtl/>
+              </w:rPr>
+              <w:t xml:space="preserve">2ד</w:t>
+            </w:r>
+          </w:p>
+        </w:tc>
+        <w:tc>
+          <w:tcPr>
+            <w:tcW w:type="dxa" w:w="4766"/>
+            <w:tcBorders>
+              <w:top w:val="single" w:color="BFBFBF" w:sz="4"/>
+              <w:left w:val="single" w:color="BFBFBF" w:sz="4"/>
+              <w:bottom w:val="single" w:color="BFBFBF" w:sz="4"/>
+              <w:right w:val="single" w:color="BFBFBF" w:sz="4"/>
+            </w:tcBorders>
+            <w:tcMar>
+              <w:top w:type="dxa" w:w="60"/>
+              <w:left w:type="dxa" w:w="100"/>
+              <w:bottom w:type="dxa" w:w="60"/>
+              <w:right w:type="dxa" w:w="100"/>
+            </w:tcMar>
+          </w:tcPr>
+          <w:p>
+            <w:pPr>
+              <w:bidi/>
+              <w:spacing w:after="0"/>
+            </w:pPr>
+            <w:r>
+              <w:rPr>
+                <w:rFonts w:ascii="Arial" w:cs="Arial" w:eastAsia="Arial" w:hAnsi="Arial"/>
+                <w:sz w:val="19"/>
+                <w:szCs w:val="19"/>
+                <w:rtl/>
+              </w:rPr>
+              <w:t xml:space="preserve">R&amp;D: בקשות לטיר 4 לפי גיל, כניסות מול יציאות</w:t>
+            </w:r>
+          </w:p>
+        </w:tc>
+        <w:tc>
+          <w:tcPr>
+            <w:tcW w:type="dxa" w:w="2217"/>
+            <w:tcBorders>
+              <w:top w:val="single" w:color="BFBFBF" w:sz="4"/>
+              <w:left w:val="single" w:color="BFBFBF" w:sz="4"/>
+              <w:bottom w:val="single" w:color="BFBFBF" w:sz="4"/>
+              <w:right w:val="single" w:color="BFBFBF" w:sz="4"/>
+            </w:tcBorders>
+            <w:tcMar>
+              <w:top w:type="dxa" w:w="60"/>
+              <w:left w:type="dxa" w:w="100"/>
+              <w:bottom w:type="dxa" w:w="60"/>
+              <w:right w:type="dxa" w:w="100"/>
+            </w:tcMar>
+          </w:tcPr>
+          <w:p>
+            <w:pPr>
+              <w:bidi/>
+              <w:spacing w:after="0"/>
+            </w:pPr>
+            <w:r>
+              <w:rPr>
+                <w:rFonts w:ascii="Arial" w:cs="Arial" w:eastAsia="Arial" w:hAnsi="Arial"/>
+                <w:sz w:val="19"/>
+                <w:szCs w:val="19"/>
+                <w:rtl/>
+              </w:rPr>
+              <w:t xml:space="preserve">2</w:t>
+            </w:r>
+          </w:p>
+        </w:tc>
+        <w:tc>
+          <w:tcPr>
+            <w:tcW w:type="dxa" w:w="1705"/>
+            <w:tcBorders>
+              <w:top w:val="single" w:color="BFBFBF" w:sz="4"/>
+              <w:left w:val="single" w:color="BFBFBF" w:sz="4"/>
+              <w:bottom w:val="single" w:color="BFBFBF" w:sz="4"/>
+              <w:right w:val="single" w:color="BFBFBF" w:sz="4"/>
+            </w:tcBorders>
+            <w:tcMar>
+              <w:top w:type="dxa" w:w="60"/>
+              <w:left w:type="dxa" w:w="100"/>
+              <w:bottom w:type="dxa" w:w="60"/>
+              <w:right w:type="dxa" w:w="100"/>
+            </w:tcMar>
+          </w:tcPr>
+          <w:p>
+            <w:pPr>
+              <w:bidi/>
+              <w:spacing w:after="0"/>
+            </w:pPr>
+            <w:r>
+              <w:rPr>
+                <w:rFonts w:ascii="Arial" w:cs="Arial" w:eastAsia="Arial" w:hAnsi="Arial"/>
+                <w:sz w:val="19"/>
+                <w:szCs w:val="19"/>
+                <w:rtl/>
+              </w:rPr>
+              <w:t xml:space="preserve">0.5</w:t>
+            </w:r>
+          </w:p>
+        </w:tc>
+      </w:tr>
+      <w:tr>
+        <w:trPr>
+          <w:tblHeader w:val="false"/>
+        </w:trPr>
+        <w:tc>
+          <w:tcPr>
+            <w:tcW w:type="dxa" w:w="950"/>
+            <w:tcBorders>
+              <w:top w:val="single" w:color="BFBFBF" w:sz="4"/>
+              <w:left w:val="single" w:color="BFBFBF" w:sz="4"/>
+              <w:bottom w:val="single" w:color="BFBFBF" w:sz="4"/>
+              <w:right w:val="single" w:color="BFBFBF" w:sz="4"/>
+            </w:tcBorders>
+            <w:tcMar>
+              <w:top w:type="dxa" w:w="60"/>
+              <w:left w:type="dxa" w:w="100"/>
+              <w:bottom w:type="dxa" w:w="60"/>
+              <w:right w:type="dxa" w:w="100"/>
+            </w:tcMar>
+          </w:tcPr>
+          <w:p>
+            <w:pPr>
+              <w:bidi/>
+              <w:spacing w:after="0"/>
+            </w:pPr>
+            <w:r>
+              <w:rPr>
+                <w:rFonts w:ascii="Arial" w:cs="Arial" w:eastAsia="Arial" w:hAnsi="Arial"/>
+                <w:sz w:val="19"/>
+                <w:szCs w:val="19"/>
+                <w:rtl/>
+              </w:rPr>
+              <w:t xml:space="preserve">2ה</w:t>
+            </w:r>
+          </w:p>
+        </w:tc>
+        <w:tc>
+          <w:tcPr>
+            <w:tcW w:type="dxa" w:w="4766"/>
+            <w:tcBorders>
+              <w:top w:val="single" w:color="BFBFBF" w:sz="4"/>
+              <w:left w:val="single" w:color="BFBFBF" w:sz="4"/>
+              <w:bottom w:val="single" w:color="BFBFBF" w:sz="4"/>
+              <w:right w:val="single" w:color="BFBFBF" w:sz="4"/>
+            </w:tcBorders>
+            <w:tcMar>
+              <w:top w:type="dxa" w:w="60"/>
+              <w:left w:type="dxa" w:w="100"/>
+              <w:bottom w:type="dxa" w:w="60"/>
+              <w:right w:type="dxa" w:w="100"/>
+            </w:tcMar>
+          </w:tcPr>
+          <w:p>
+            <w:pPr>
+              <w:bidi/>
+              <w:spacing w:after="0"/>
+            </w:pPr>
+            <w:r>
+              <w:rPr>
+                <w:rFonts w:ascii="Arial" w:cs="Arial" w:eastAsia="Arial" w:hAnsi="Arial"/>
+                <w:sz w:val="19"/>
+                <w:szCs w:val="19"/>
+                <w:rtl/>
+              </w:rPr>
+              <w:t xml:space="preserve">בתי חולים: דירוג מוחלט ומנורמל</w:t>
+            </w:r>
+          </w:p>
+        </w:tc>
+        <w:tc>
+          <w:tcPr>
+            <w:tcW w:type="dxa" w:w="2217"/>
+            <w:tcBorders>
+              <w:top w:val="single" w:color="BFBFBF" w:sz="4"/>
+              <w:left w:val="single" w:color="BFBFBF" w:sz="4"/>
+              <w:bottom w:val="single" w:color="BFBFBF" w:sz="4"/>
+              <w:right w:val="single" w:color="BFBFBF" w:sz="4"/>
+            </w:tcBorders>
+            <w:tcMar>
+              <w:top w:type="dxa" w:w="60"/>
+              <w:left w:type="dxa" w:w="100"/>
+              <w:bottom w:type="dxa" w:w="60"/>
+              <w:right w:type="dxa" w:w="100"/>
+            </w:tcMar>
+          </w:tcPr>
+          <w:p>
+            <w:pPr>
+              <w:bidi/>
+              <w:spacing w:after="0"/>
+            </w:pPr>
+            <w:r>
+              <w:rPr>
+                <w:rFonts w:ascii="Arial" w:cs="Arial" w:eastAsia="Arial" w:hAnsi="Arial"/>
+                <w:sz w:val="19"/>
+                <w:szCs w:val="19"/>
+                <w:rtl/>
+              </w:rPr>
+              <w:t xml:space="preserve">2</w:t>
+            </w:r>
+          </w:p>
+        </w:tc>
+        <w:tc>
+          <w:tcPr>
+            <w:tcW w:type="dxa" w:w="1705"/>
+            <w:tcBorders>
+              <w:top w:val="single" w:color="BFBFBF" w:sz="4"/>
+              <w:left w:val="single" w:color="BFBFBF" w:sz="4"/>
+              <w:bottom w:val="single" w:color="BFBFBF" w:sz="4"/>
+              <w:right w:val="single" w:color="BFBFBF" w:sz="4"/>
+            </w:tcBorders>
+            <w:tcMar>
+              <w:top w:type="dxa" w:w="60"/>
+              <w:left w:type="dxa" w:w="100"/>
+              <w:bottom w:type="dxa" w:w="60"/>
+              <w:right w:type="dxa" w:w="100"/>
+            </w:tcMar>
+          </w:tcPr>
+          <w:p>
+            <w:pPr>
+              <w:bidi/>
+              <w:spacing w:after="0"/>
+            </w:pPr>
+            <w:r>
+              <w:rPr>
+                <w:rFonts w:ascii="Arial" w:cs="Arial" w:eastAsia="Arial" w:hAnsi="Arial"/>
+                <w:sz w:val="19"/>
+                <w:szCs w:val="19"/>
+                <w:rtl/>
+              </w:rPr>
+              <w:t xml:space="preserve">0.5</w:t>
+            </w:r>
+          </w:p>
+        </w:tc>
+      </w:tr>
+      <w:tr>
+        <w:trPr>
+          <w:tblHeader w:val="false"/>
+        </w:trPr>
+        <w:tc>
+          <w:tcPr>
+            <w:tcW w:type="dxa" w:w="950"/>
+            <w:tcBorders>
+              <w:top w:val="single" w:color="BFBFBF" w:sz="4"/>
+              <w:left w:val="single" w:color="BFBFBF" w:sz="4"/>
+              <w:bottom w:val="single" w:color="BFBFBF" w:sz="4"/>
+              <w:right w:val="single" w:color="BFBFBF" w:sz="4"/>
+            </w:tcBorders>
+            <w:tcMar>
+              <w:top w:type="dxa" w:w="60"/>
+              <w:left w:type="dxa" w:w="100"/>
+              <w:bottom w:type="dxa" w:w="60"/>
+              <w:right w:type="dxa" w:w="100"/>
+            </w:tcMar>
+          </w:tcPr>
+          <w:p>
+            <w:pPr>
+              <w:bidi/>
+              <w:spacing w:after="0"/>
+            </w:pPr>
+            <w:r>
+              <w:rPr>
+                <w:rFonts w:ascii="Arial" w:cs="Arial" w:eastAsia="Arial" w:hAnsi="Arial"/>
+                <w:sz w:val="19"/>
+                <w:szCs w:val="19"/>
+                <w:rtl/>
+              </w:rPr>
+              <w:t xml:space="preserve">2ו</w:t>
+            </w:r>
+          </w:p>
+        </w:tc>
+        <w:tc>
+          <w:tcPr>
+            <w:tcW w:type="dxa" w:w="4766"/>
+            <w:tcBorders>
+              <w:top w:val="single" w:color="BFBFBF" w:sz="4"/>
+              <w:left w:val="single" w:color="BFBFBF" w:sz="4"/>
+              <w:bottom w:val="single" w:color="BFBFBF" w:sz="4"/>
+              <w:right w:val="single" w:color="BFBFBF" w:sz="4"/>
+            </w:tcBorders>
+            <w:tcMar>
+              <w:top w:type="dxa" w:w="60"/>
+              <w:left w:type="dxa" w:w="100"/>
+              <w:bottom w:type="dxa" w:w="60"/>
+              <w:right w:type="dxa" w:w="100"/>
+            </w:tcMar>
+          </w:tcPr>
+          <w:p>
+            <w:pPr>
+              <w:bidi/>
+              <w:spacing w:after="0"/>
+            </w:pPr>
+            <w:r>
+              <w:rPr>
+                <w:rFonts w:ascii="Arial" w:cs="Arial" w:eastAsia="Arial" w:hAnsi="Arial"/>
+                <w:sz w:val="19"/>
+                <w:szCs w:val="19"/>
+                <w:rtl/>
+              </w:rPr>
+              <w:t xml:space="preserve">דוחות PDF מתוזמנים (יומי, שבועי, Management Review)</w:t>
+            </w:r>
+          </w:p>
+        </w:tc>
+        <w:tc>
+          <w:tcPr>
+            <w:tcW w:type="dxa" w:w="2217"/>
+            <w:tcBorders>
+              <w:top w:val="single" w:color="BFBFBF" w:sz="4"/>
+              <w:left w:val="single" w:color="BFBFBF" w:sz="4"/>
+              <w:bottom w:val="single" w:color="BFBFBF" w:sz="4"/>
+              <w:right w:val="single" w:color="BFBFBF" w:sz="4"/>
+            </w:tcBorders>
+            <w:tcMar>
+              <w:top w:type="dxa" w:w="60"/>
+              <w:left w:type="dxa" w:w="100"/>
+              <w:bottom w:type="dxa" w:w="60"/>
+              <w:right w:type="dxa" w:w="100"/>
+            </w:tcMar>
+          </w:tcPr>
+          <w:p>
+            <w:pPr>
+              <w:bidi/>
+              <w:spacing w:after="0"/>
+            </w:pPr>
+            <w:r>
+              <w:rPr>
+                <w:rFonts w:ascii="Arial" w:cs="Arial" w:eastAsia="Arial" w:hAnsi="Arial"/>
+                <w:sz w:val="19"/>
+                <w:szCs w:val="19"/>
+                <w:rtl/>
+              </w:rPr>
+              <w:t xml:space="preserve">2-3</w:t>
+            </w:r>
+          </w:p>
+        </w:tc>
+        <w:tc>
+          <w:tcPr>
+            <w:tcW w:type="dxa" w:w="1705"/>
+            <w:tcBorders>
+              <w:top w:val="single" w:color="BFBFBF" w:sz="4"/>
+              <w:left w:val="single" w:color="BFBFBF" w:sz="4"/>
+              <w:bottom w:val="single" w:color="BFBFBF" w:sz="4"/>
+              <w:right w:val="single" w:color="BFBFBF" w:sz="4"/>
+            </w:tcBorders>
+            <w:tcMar>
+              <w:top w:type="dxa" w:w="60"/>
+              <w:left w:type="dxa" w:w="100"/>
+              <w:bottom w:type="dxa" w:w="60"/>
+              <w:right w:type="dxa" w:w="100"/>
+            </w:tcMar>
+          </w:tcPr>
+          <w:p>
+            <w:pPr>
+              <w:bidi/>
+              <w:spacing w:after="0"/>
+            </w:pPr>
+            <w:r>
+              <w:rPr>
+                <w:rFonts w:ascii="Arial" w:cs="Arial" w:eastAsia="Arial" w:hAnsi="Arial"/>
+                <w:sz w:val="19"/>
+                <w:szCs w:val="19"/>
+                <w:rtl/>
+              </w:rPr>
+              <w:t xml:space="preserve">0.5</w:t>
+            </w:r>
+          </w:p>
+        </w:tc>
+      </w:tr>
+      <w:tr>
+        <w:trPr>
+          <w:tblHeader w:val="false"/>
+        </w:trPr>
+        <w:tc>
+          <w:tcPr>
+            <w:tcW w:type="dxa" w:w="950"/>
+            <w:tcBorders>
+              <w:top w:val="single" w:color="BFBFBF" w:sz="4"/>
+              <w:left w:val="single" w:color="BFBFBF" w:sz="4"/>
+              <w:bottom w:val="single" w:color="BFBFBF" w:sz="4"/>
+              <w:right w:val="single" w:color="BFBFBF" w:sz="4"/>
+            </w:tcBorders>
+            <w:tcMar>
+              <w:top w:type="dxa" w:w="60"/>
+              <w:left w:type="dxa" w:w="100"/>
+              <w:bottom w:type="dxa" w:w="60"/>
+              <w:right w:type="dxa" w:w="100"/>
+            </w:tcMar>
+          </w:tcPr>
+          <w:p>
+            <w:pPr>
+              <w:bidi/>
+              <w:spacing w:after="0"/>
+            </w:pPr>
+            <w:r>
+              <w:rPr>
+                <w:rFonts w:ascii="Arial" w:cs="Arial" w:eastAsia="Arial" w:hAnsi="Arial"/>
+                <w:sz w:val="19"/>
+                <w:szCs w:val="19"/>
+                <w:rtl/>
+              </w:rPr>
+              <w:t xml:space="preserve">2ז</w:t>
+            </w:r>
+          </w:p>
+        </w:tc>
+        <w:tc>
+          <w:tcPr>
+            <w:tcW w:type="dxa" w:w="4766"/>
+            <w:tcBorders>
+              <w:top w:val="single" w:color="BFBFBF" w:sz="4"/>
+              <w:left w:val="single" w:color="BFBFBF" w:sz="4"/>
+              <w:bottom w:val="single" w:color="BFBFBF" w:sz="4"/>
+              <w:right w:val="single" w:color="BFBFBF" w:sz="4"/>
+            </w:tcBorders>
+            <w:tcMar>
+              <w:top w:type="dxa" w:w="60"/>
+              <w:left w:type="dxa" w:w="100"/>
+              <w:bottom w:type="dxa" w:w="60"/>
+              <w:right w:type="dxa" w:w="100"/>
+            </w:tcMar>
+          </w:tcPr>
+          <w:p>
+            <w:pPr>
+              <w:bidi/>
+              <w:spacing w:after="0"/>
+            </w:pPr>
+            <w:r>
+              <w:rPr>
+                <w:rFonts w:ascii="Arial" w:cs="Arial" w:eastAsia="Arial" w:hAnsi="Arial"/>
+                <w:sz w:val="19"/>
+                <w:szCs w:val="19"/>
+                <w:rtl/>
+              </w:rPr>
+              <w:t xml:space="preserve">התראות (P1, SLA, בקשות לא משויכות), אם יוחלט להכניס אותן למערכת</w:t>
+            </w:r>
+          </w:p>
+        </w:tc>
+        <w:tc>
+          <w:tcPr>
+            <w:tcW w:type="dxa" w:w="2217"/>
+            <w:tcBorders>
+              <w:top w:val="single" w:color="BFBFBF" w:sz="4"/>
+              <w:left w:val="single" w:color="BFBFBF" w:sz="4"/>
+              <w:bottom w:val="single" w:color="BFBFBF" w:sz="4"/>
+              <w:right w:val="single" w:color="BFBFBF" w:sz="4"/>
+            </w:tcBorders>
+            <w:tcMar>
+              <w:top w:type="dxa" w:w="60"/>
+              <w:left w:type="dxa" w:w="100"/>
+              <w:bottom w:type="dxa" w:w="60"/>
+              <w:right w:type="dxa" w:w="100"/>
+            </w:tcMar>
+          </w:tcPr>
+          <w:p>
+            <w:pPr>
+              <w:bidi/>
+              <w:spacing w:after="0"/>
+            </w:pPr>
+            <w:r>
+              <w:rPr>
+                <w:rFonts w:ascii="Arial" w:cs="Arial" w:eastAsia="Arial" w:hAnsi="Arial"/>
+                <w:sz w:val="19"/>
+                <w:szCs w:val="19"/>
+                <w:rtl/>
+              </w:rPr>
+              <w:t xml:space="preserve">2</w:t>
+            </w:r>
+          </w:p>
+        </w:tc>
+        <w:tc>
+          <w:tcPr>
+            <w:tcW w:type="dxa" w:w="1705"/>
+            <w:tcBorders>
+              <w:top w:val="single" w:color="BFBFBF" w:sz="4"/>
+              <w:left w:val="single" w:color="BFBFBF" w:sz="4"/>
+              <w:bottom w:val="single" w:color="BFBFBF" w:sz="4"/>
+              <w:right w:val="single" w:color="BFBFBF" w:sz="4"/>
+            </w:tcBorders>
+            <w:tcMar>
+              <w:top w:type="dxa" w:w="60"/>
+              <w:left w:type="dxa" w:w="100"/>
+              <w:bottom w:type="dxa" w:w="60"/>
+              <w:right w:type="dxa" w:w="100"/>
+            </w:tcMar>
+          </w:tcPr>
+          <w:p>
+            <w:pPr>
+              <w:bidi/>
+              <w:spacing w:after="0"/>
+            </w:pPr>
+            <w:r>
+              <w:rPr>
+                <w:rFonts w:ascii="Arial" w:cs="Arial" w:eastAsia="Arial" w:hAnsi="Arial"/>
+                <w:sz w:val="19"/>
+                <w:szCs w:val="19"/>
+                <w:rtl/>
+              </w:rPr>
+              <w:t xml:space="preserve">0</w:t>
+            </w:r>
+          </w:p>
+        </w:tc>
+      </w:tr>
+      <w:tr>
+        <w:trPr>
+          <w:tblHeader w:val="false"/>
+        </w:trPr>
+        <w:tc>
+          <w:tcPr>
+            <w:tcW w:type="dxa" w:w="950"/>
+            <w:tcBorders>
+              <w:top w:val="single" w:color="BFBFBF" w:sz="4"/>
+              <w:left w:val="single" w:color="BFBFBF" w:sz="4"/>
+              <w:bottom w:val="single" w:color="BFBFBF" w:sz="4"/>
+              <w:right w:val="single" w:color="BFBFBF" w:sz="4"/>
+            </w:tcBorders>
+            <w:tcMar>
+              <w:top w:type="dxa" w:w="60"/>
+              <w:left w:type="dxa" w:w="100"/>
+              <w:bottom w:type="dxa" w:w="60"/>
+              <w:right w:type="dxa" w:w="100"/>
+            </w:tcMar>
+          </w:tcPr>
+          <w:p>
+            <w:pPr>
+              <w:bidi/>
+              <w:spacing w:after="0"/>
+            </w:pPr>
+            <w:r>
+              <w:rPr>
+                <w:rFonts w:ascii="Arial" w:cs="Arial" w:eastAsia="Arial" w:hAnsi="Arial"/>
+                <w:b/>
+                <w:bCs/>
+                <w:sz w:val="19"/>
+                <w:szCs w:val="19"/>
+                <w:rtl/>
+              </w:rPr>
+              <w:t xml:space="preserve">סה"כ</w:t>
+            </w:r>
+          </w:p>
+        </w:tc>
+        <w:tc>
+          <w:tcPr>
+            <w:tcW w:type="dxa" w:w="4766"/>
+            <w:tcBorders>
+              <w:top w:val="single" w:color="BFBFBF" w:sz="4"/>
+              <w:left w:val="single" w:color="BFBFBF" w:sz="4"/>
+              <w:bottom w:val="single" w:color="BFBFBF" w:sz="4"/>
+              <w:right w:val="single" w:color="BFBFBF" w:sz="4"/>
+            </w:tcBorders>
+            <w:tcMar>
+              <w:top w:type="dxa" w:w="60"/>
+              <w:left w:type="dxa" w:w="100"/>
+              <w:bottom w:type="dxa" w:w="60"/>
+              <w:right w:type="dxa" w:w="100"/>
+            </w:tcMar>
+          </w:tcPr>
+          <w:p>
+            <w:pPr>
+              <w:bidi/>
+              <w:spacing w:after="0"/>
+            </w:pPr>
+          </w:p>
+        </w:tc>
+        <w:tc>
+          <w:tcPr>
+            <w:tcW w:type="dxa" w:w="2217"/>
+            <w:tcBorders>
+              <w:top w:val="single" w:color="BFBFBF" w:sz="4"/>
+              <w:left w:val="single" w:color="BFBFBF" w:sz="4"/>
+              <w:bottom w:val="single" w:color="BFBFBF" w:sz="4"/>
+              <w:right w:val="single" w:color="BFBFBF" w:sz="4"/>
+            </w:tcBorders>
+            <w:tcMar>
+              <w:top w:type="dxa" w:w="60"/>
+              <w:left w:type="dxa" w:w="100"/>
+              <w:bottom w:type="dxa" w:w="60"/>
+              <w:right w:type="dxa" w:w="100"/>
+            </w:tcMar>
+          </w:tcPr>
+          <w:p>
+            <w:pPr>
+              <w:bidi/>
+              <w:spacing w:after="0"/>
+            </w:pPr>
+            <w:r>
+              <w:rPr>
+                <w:rFonts w:ascii="Arial" w:cs="Arial" w:eastAsia="Arial" w:hAnsi="Arial"/>
+                <w:b/>
+                <w:bCs/>
+                <w:sz w:val="19"/>
+                <w:szCs w:val="19"/>
+                <w:rtl/>
+              </w:rPr>
+              <w:t xml:space="preserve">כ-15-18</w:t>
+            </w:r>
+          </w:p>
+        </w:tc>
+        <w:tc>
+          <w:tcPr>
+            <w:tcW w:type="dxa" w:w="1705"/>
+            <w:tcBorders>
+              <w:top w:val="single" w:color="BFBFBF" w:sz="4"/>
+              <w:left w:val="single" w:color="BFBFBF" w:sz="4"/>
+              <w:bottom w:val="single" w:color="BFBFBF" w:sz="4"/>
+              <w:right w:val="single" w:color="BFBFBF" w:sz="4"/>
+            </w:tcBorders>
+            <w:tcMar>
+              <w:top w:type="dxa" w:w="60"/>
+              <w:left w:type="dxa" w:w="100"/>
+              <w:bottom w:type="dxa" w:w="60"/>
+              <w:right w:type="dxa" w:w="100"/>
+            </w:tcMar>
+          </w:tcPr>
+          <w:p>
+            <w:pPr>
+              <w:bidi/>
+              <w:spacing w:after="0"/>
+            </w:pPr>
+            <w:r>
+              <w:rPr>
+                <w:rFonts w:ascii="Arial" w:cs="Arial" w:eastAsia="Arial" w:hAnsi="Arial"/>
+                <w:b/>
+                <w:bCs/>
+                <w:sz w:val="19"/>
+                <w:szCs w:val="19"/>
+                <w:rtl/>
+              </w:rPr>
+              <w:t xml:space="preserve">כ-7-9</w:t>
+            </w:r>
+          </w:p>
+        </w:tc>
+      </w:tr>
+      <w:tr>
+        <w:trPr>
+          <w:tblHeader w:val="false"/>
+        </w:trPr>
+        <w:tc>
+          <w:tcPr>
+            <w:tcW w:type="dxa" w:w="950"/>
+            <w:tcBorders>
+              <w:top w:val="single" w:color="BFBFBF" w:sz="4"/>
+              <w:left w:val="single" w:color="BFBFBF" w:sz="4"/>
+              <w:bottom w:val="single" w:color="BFBFBF" w:sz="4"/>
+              <w:right w:val="single" w:color="BFBFBF" w:sz="4"/>
+            </w:tcBorders>
+            <w:tcMar>
+              <w:top w:type="dxa" w:w="60"/>
+              <w:left w:type="dxa" w:w="100"/>
+              <w:bottom w:type="dxa" w:w="60"/>
+              <w:right w:type="dxa" w:w="100"/>
+            </w:tcMar>
+          </w:tcPr>
+          <w:p>
+            <w:pPr>
+              <w:bidi/>
+              <w:spacing w:after="0"/>
+            </w:pPr>
+            <w:r>
+              <w:rPr>
+                <w:rFonts w:ascii="Arial" w:cs="Arial" w:eastAsia="Arial" w:hAnsi="Arial"/>
+                <w:sz w:val="19"/>
+                <w:szCs w:val="19"/>
+                <w:rtl/>
+              </w:rPr>
+              <w:t xml:space="preserve">3</w:t>
+            </w:r>
+          </w:p>
+        </w:tc>
+        <w:tc>
+          <w:tcPr>
+            <w:tcW w:type="dxa" w:w="4766"/>
+            <w:tcBorders>
+              <w:top w:val="single" w:color="BFBFBF" w:sz="4"/>
+              <w:left w:val="single" w:color="BFBFBF" w:sz="4"/>
+              <w:bottom w:val="single" w:color="BFBFBF" w:sz="4"/>
+              <w:right w:val="single" w:color="BFBFBF" w:sz="4"/>
+            </w:tcBorders>
+            <w:tcMar>
+              <w:top w:type="dxa" w:w="60"/>
+              <w:left w:type="dxa" w:w="100"/>
+              <w:bottom w:type="dxa" w:w="60"/>
+              <w:right w:type="dxa" w:w="100"/>
+            </w:tcMar>
+          </w:tcPr>
+          <w:p>
+            <w:pPr>
+              <w:bidi/>
+              <w:spacing w:after="0"/>
+            </w:pPr>
+            <w:r>
+              <w:rPr>
+                <w:rFonts w:ascii="Arial" w:cs="Arial" w:eastAsia="Arial" w:hAnsi="Arial"/>
+                <w:sz w:val="19"/>
+                <w:szCs w:val="19"/>
+                <w:rtl/>
+              </w:rPr>
+              <w:t xml:space="preserve">אפליקציה לטלפון, מעל אותו API (לפי MVP-Mobile, בלי בניית שרת מחדש)</w:t>
+            </w:r>
+          </w:p>
+        </w:tc>
+        <w:tc>
+          <w:tcPr>
+            <w:tcW w:type="dxa" w:w="2217"/>
+            <w:tcBorders>
+              <w:top w:val="single" w:color="BFBFBF" w:sz="4"/>
+              <w:left w:val="single" w:color="BFBFBF" w:sz="4"/>
+              <w:bottom w:val="single" w:color="BFBFBF" w:sz="4"/>
+              <w:right w:val="single" w:color="BFBFBF" w:sz="4"/>
+            </w:tcBorders>
+            <w:tcMar>
+              <w:top w:type="dxa" w:w="60"/>
+              <w:left w:type="dxa" w:w="100"/>
+              <w:bottom w:type="dxa" w:w="60"/>
+              <w:right w:type="dxa" w:w="100"/>
+            </w:tcMar>
+          </w:tcPr>
+          <w:p>
+            <w:pPr>
+              <w:bidi/>
+              <w:spacing w:after="0"/>
+            </w:pPr>
+            <w:r>
+              <w:rPr>
+                <w:rFonts w:ascii="Arial" w:cs="Arial" w:eastAsia="Arial" w:hAnsi="Arial"/>
+                <w:sz w:val="19"/>
+                <w:szCs w:val="19"/>
+                <w:rtl/>
+              </w:rPr>
+              <w:t xml:space="preserve">כ-12-16 (שני מפתחי מובייל)</w:t>
+            </w:r>
+          </w:p>
+        </w:tc>
+        <w:tc>
+          <w:tcPr>
+            <w:tcW w:type="dxa" w:w="1705"/>
+            <w:tcBorders>
+              <w:top w:val="single" w:color="BFBFBF" w:sz="4"/>
+              <w:left w:val="single" w:color="BFBFBF" w:sz="4"/>
+              <w:bottom w:val="single" w:color="BFBFBF" w:sz="4"/>
+              <w:right w:val="single" w:color="BFBFBF" w:sz="4"/>
+            </w:tcBorders>
+            <w:tcMar>
+              <w:top w:type="dxa" w:w="60"/>
+              <w:left w:type="dxa" w:w="100"/>
+              <w:bottom w:type="dxa" w:w="60"/>
+              <w:right w:type="dxa" w:w="100"/>
+            </w:tcMar>
+          </w:tcPr>
+          <w:p>
+            <w:pPr>
+              <w:bidi/>
+              <w:spacing w:after="0"/>
+            </w:pPr>
+            <w:r>
+              <w:rPr>
+                <w:rFonts w:ascii="Arial" w:cs="Arial" w:eastAsia="Arial" w:hAnsi="Arial"/>
+                <w:sz w:val="19"/>
+                <w:szCs w:val="19"/>
+                <w:rtl/>
+              </w:rPr>
+              <w:t xml:space="preserve">0</w:t>
+            </w:r>
+          </w:p>
+        </w:tc>
+      </w:tr>
+    </w:tbl>
+    <w:p>
+      <w:pPr>
+        <w:spacing w:after="120"/>
+      </w:pPr>
+    </w:p>
+    <w:p>
+      <w:pPr>
+        <w:bidi/>
+        <w:spacing w:after="120" w:line="276"/>
+        <w:jc w:val="start"/>
+      </w:pPr>
+      <w:r>
+        <w:rPr>
+          <w:rFonts w:ascii="Arial" w:cs="Arial" w:eastAsia="Arial" w:hAnsi="Arial"/>
+          <w:b/>
+          <w:bCs/>
+          <w:rtl/>
+        </w:rPr>
+        <w:t xml:space="preserve">מה זה אומר בפועל:</w:t>
+      </w:r>
+    </w:p>
+    <w:p>
+      <w:pPr>
+        <w:pStyle w:val="ListParagraph"/>
+        <w:numPr>
+          <w:ilvl w:val="0"/>
+          <w:numId w:val="2"/>
+        </w:numPr>
+        <w:bidi/>
+        <w:spacing w:after="60"/>
+        <w:jc w:val="start"/>
+      </w:pPr>
+      <w:r>
+        <w:rPr>
+          <w:rFonts w:ascii="Arial" w:cs="Arial" w:eastAsia="Arial" w:hAnsi="Arial"/>
+          <w:b/>
+          <w:bCs/>
+          <w:rtl/>
+        </w:rPr>
+        <w:t xml:space="preserve">מפתח אחד</w:t>
+      </w:r>
+      <w:r>
+        <w:rPr>
+          <w:rFonts w:ascii="Arial" w:cs="Arial" w:eastAsia="Arial" w:hAnsi="Arial"/>
+          <w:rtl/>
+        </w:rPr>
+        <w:t xml:space="preserve"> שגם מתחזק (20-30% מהזמן) וגם מפתח: הגל השני ייקח בערך </w:t>
+      </w:r>
+      <w:r>
+        <w:rPr>
+          <w:rFonts w:ascii="Arial" w:cs="Arial" w:eastAsia="Arial" w:hAnsi="Arial"/>
+          <w:b/>
+          <w:bCs/>
+          <w:rtl/>
+        </w:rPr>
+        <w:t xml:space="preserve">5-6 חודשים</w:t>
+      </w:r>
+      <w:r>
+        <w:rPr>
+          <w:rFonts w:ascii="Arial" w:cs="Arial" w:eastAsia="Arial" w:hAnsi="Arial"/>
+          <w:rtl/>
+        </w:rPr>
+        <w:t xml:space="preserve"> אחרי העלייה לאוויר.</w:t>
+      </w:r>
+    </w:p>
+    <w:p>
+      <w:pPr>
+        <w:pStyle w:val="ListParagraph"/>
+        <w:numPr>
+          <w:ilvl w:val="0"/>
+          <w:numId w:val="2"/>
+        </w:numPr>
+        <w:bidi/>
+        <w:spacing w:after="60"/>
+        <w:jc w:val="start"/>
+      </w:pPr>
+      <w:r>
+        <w:rPr>
+          <w:rFonts w:ascii="Arial" w:cs="Arial" w:eastAsia="Arial" w:hAnsi="Arial"/>
+          <w:b/>
+          <w:bCs/>
+          <w:rtl/>
+        </w:rPr>
+        <w:t xml:space="preserve">שני מפתחים:</w:t>
+      </w:r>
+      <w:r>
+        <w:rPr>
+          <w:rFonts w:ascii="Arial" w:cs="Arial" w:eastAsia="Arial" w:hAnsi="Arial"/>
+          <w:rtl/>
+        </w:rPr>
+        <w:t xml:space="preserve"> בערך </w:t>
+      </w:r>
+      <w:r>
+        <w:rPr>
+          <w:rFonts w:ascii="Arial" w:cs="Arial" w:eastAsia="Arial" w:hAnsi="Arial"/>
+          <w:b/>
+          <w:bCs/>
+          <w:rtl/>
+        </w:rPr>
+        <w:t xml:space="preserve">2.5-3 חודשים</w:t>
+      </w:r>
+      <w:r>
+        <w:rPr>
+          <w:rFonts w:ascii="Arial" w:cs="Arial" w:eastAsia="Arial" w:hAnsi="Arial"/>
+          <w:rtl/>
+        </w:rPr>
+        <w:t xml:space="preserve">.</w:t>
+      </w:r>
+    </w:p>
+    <w:p>
+      <w:pPr>
+        <w:pStyle w:val="ListParagraph"/>
+        <w:numPr>
+          <w:ilvl w:val="0"/>
+          <w:numId w:val="2"/>
+        </w:numPr>
+        <w:bidi/>
+        <w:spacing w:after="60"/>
+        <w:jc w:val="start"/>
+      </w:pPr>
+      <w:r>
+        <w:rPr>
+          <w:rFonts w:ascii="Arial" w:cs="Arial" w:eastAsia="Arial" w:hAnsi="Arial"/>
+          <w:b/>
+          <w:bCs/>
+          <w:rtl/>
+        </w:rPr>
+        <w:t xml:space="preserve">DBA:</w:t>
+      </w:r>
+      <w:r>
+        <w:rPr>
+          <w:rFonts w:ascii="Arial" w:cs="Arial" w:eastAsia="Arial" w:hAnsi="Arial"/>
+          <w:rtl/>
+        </w:rPr>
+        <w:t xml:space="preserve"> כ-7-9 שבועות עבודה לאורך התקופה, כלומר בערך חצי משרה בחודשים האלה.</w:t>
+      </w:r>
+    </w:p>
+    <w:p>
+      <w:pPr>
+        <w:pStyle w:val="ListParagraph"/>
+        <w:numPr>
+          <w:ilvl w:val="0"/>
+          <w:numId w:val="2"/>
+        </w:numPr>
+        <w:bidi/>
+        <w:spacing w:after="60"/>
+        <w:jc w:val="start"/>
+      </w:pPr>
+      <w:r>
+        <w:rPr>
+          <w:rFonts w:ascii="Arial" w:cs="Arial" w:eastAsia="Arial" w:hAnsi="Arial"/>
+          <w:b/>
+          <w:bCs/>
+          <w:rtl/>
+        </w:rPr>
+        <w:t xml:space="preserve">בלי כלי BI, כל שאלה אנליטית חדשה היא משימת פיתוח.</w:t>
+      </w:r>
+      <w:r>
+        <w:rPr>
+          <w:rFonts w:ascii="Arial" w:cs="Arial" w:eastAsia="Arial" w:hAnsi="Arial"/>
+          <w:rtl/>
+        </w:rPr>
+        <w:t xml:space="preserve"> כדאי לקבוע מראש תהליך: בקשות נאספות, מתועדפות פעם בחודש, ונכנסות לגל הבא. בלי תהליך כזה, המפתח יעבוד רק על בקשות חד-פעמיות.</w:t>
+      </w:r>
+    </w:p>
+    <w:p>
+      <w:pPr>
         <w:pStyle w:val="Heading1"/>
         <w:bidi/>
       </w:pPr>
@@ -7886,10 +10401,10 @@
         <w:tblLayout w:type="fixed"/>
       </w:tblPr>
       <w:tblGrid>
-        <w:gridCol w:w="3306"/>
-        <w:gridCol w:w="1055"/>
-        <w:gridCol w:w="1055"/>
-        <w:gridCol w:w="4222"/>
+        <w:gridCol w:w="3696"/>
+        <w:gridCol w:w="990"/>
+        <w:gridCol w:w="990"/>
+        <w:gridCol w:w="3962"/>
       </w:tblGrid>
       <w:tr>
         <w:trPr>
@@ -7897,7 +10412,7 @@
         </w:trPr>
         <w:tc>
           <w:tcPr>
-            <w:tcW w:type="dxa" w:w="3306"/>
+            <w:tcW w:type="dxa" w:w="3696"/>
             <w:tcBorders>
               <w:top w:val="single" w:color="BFBFBF" w:sz="4"/>
               <w:left w:val="single" w:color="BFBFBF" w:sz="4"/>
@@ -7932,7 +10447,7 @@
         </w:tc>
         <w:tc>
           <w:tcPr>
-            <w:tcW w:type="dxa" w:w="1055"/>
+            <w:tcW w:type="dxa" w:w="990"/>
             <w:tcBorders>
               <w:top w:val="single" w:color="BFBFBF" w:sz="4"/>
               <w:left w:val="single" w:color="BFBFBF" w:sz="4"/>
@@ -7967,7 +10482,7 @@
         </w:tc>
         <w:tc>
           <w:tcPr>
-            <w:tcW w:type="dxa" w:w="1055"/>
+            <w:tcW w:type="dxa" w:w="990"/>
             <w:tcBorders>
               <w:top w:val="single" w:color="BFBFBF" w:sz="4"/>
               <w:left w:val="single" w:color="BFBFBF" w:sz="4"/>
@@ -8002,7 +10517,7 @@
         </w:tc>
         <w:tc>
           <w:tcPr>
-            <w:tcW w:type="dxa" w:w="4222"/>
+            <w:tcW w:type="dxa" w:w="3962"/>
             <w:tcBorders>
               <w:top w:val="single" w:color="BFBFBF" w:sz="4"/>
               <w:left w:val="single" w:color="BFBFBF" w:sz="4"/>
@@ -8042,7 +10557,7 @@
         </w:trPr>
         <w:tc>
           <w:tcPr>
-            <w:tcW w:type="dxa" w:w="3306"/>
+            <w:tcW w:type="dxa" w:w="3696"/>
             <w:tcBorders>
               <w:top w:val="single" w:color="BFBFBF" w:sz="4"/>
               <w:left w:val="single" w:color="BFBFBF" w:sz="4"/>
@@ -8074,7 +10589,7 @@
         </w:tc>
         <w:tc>
           <w:tcPr>
-            <w:tcW w:type="dxa" w:w="1055"/>
+            <w:tcW w:type="dxa" w:w="990"/>
             <w:tcBorders>
               <w:top w:val="single" w:color="BFBFBF" w:sz="4"/>
               <w:left w:val="single" w:color="BFBFBF" w:sz="4"/>
@@ -8106,7 +10621,7 @@
         </w:tc>
         <w:tc>
           <w:tcPr>
-            <w:tcW w:type="dxa" w:w="1055"/>
+            <w:tcW w:type="dxa" w:w="990"/>
             <w:tcBorders>
               <w:top w:val="single" w:color="BFBFBF" w:sz="4"/>
               <w:left w:val="single" w:color="BFBFBF" w:sz="4"/>
@@ -8138,7 +10653,7 @@
         </w:tc>
         <w:tc>
           <w:tcPr>
-            <w:tcW w:type="dxa" w:w="4222"/>
+            <w:tcW w:type="dxa" w:w="3962"/>
             <w:tcBorders>
               <w:top w:val="single" w:color="BFBFBF" w:sz="4"/>
               <w:left w:val="single" w:color="BFBFBF" w:sz="4"/>
@@ -8175,130 +10690,25 @@
         </w:trPr>
         <w:tc>
           <w:tcPr>
-            <w:tcW w:type="dxa" w:w="3306"/>
-            <w:tcBorders>
-              <w:top w:val="single" w:color="BFBFBF" w:sz="4"/>
-              <w:left w:val="single" w:color="BFBFBF" w:sz="4"/>
-              <w:bottom w:val="single" w:color="BFBFBF" w:sz="4"/>
-              <w:right w:val="single" w:color="BFBFBF" w:sz="4"/>
-            </w:tcBorders>
-            <w:tcMar>
-              <w:top w:type="dxa" w:w="60"/>
-              <w:left w:type="dxa" w:w="100"/>
-              <w:bottom w:type="dxa" w:w="60"/>
-              <w:right w:type="dxa" w:w="100"/>
-            </w:tcMar>
-          </w:tcPr>
-          <w:p>
-            <w:pPr>
-              <w:bidi/>
-              <w:spacing w:after="0"/>
-            </w:pPr>
-            <w:r>
-              <w:rPr>
-                <w:rFonts w:ascii="Arial" w:cs="Arial" w:eastAsia="Arial" w:hAnsi="Arial"/>
-                <w:sz w:val="19"/>
-                <w:szCs w:val="19"/>
-                <w:rtl/>
-              </w:rPr>
-              <w:t xml:space="preserve">אין בעלים לתחזוקה אחרי העלייה</w:t>
-            </w:r>
-          </w:p>
-        </w:tc>
-        <w:tc>
-          <w:tcPr>
-            <w:tcW w:type="dxa" w:w="1055"/>
-            <w:tcBorders>
-              <w:top w:val="single" w:color="BFBFBF" w:sz="4"/>
-              <w:left w:val="single" w:color="BFBFBF" w:sz="4"/>
-              <w:bottom w:val="single" w:color="BFBFBF" w:sz="4"/>
-              <w:right w:val="single" w:color="BFBFBF" w:sz="4"/>
-            </w:tcBorders>
-            <w:tcMar>
-              <w:top w:type="dxa" w:w="60"/>
-              <w:left w:type="dxa" w:w="100"/>
-              <w:bottom w:type="dxa" w:w="60"/>
-              <w:right w:type="dxa" w:w="100"/>
-            </w:tcMar>
-          </w:tcPr>
-          <w:p>
-            <w:pPr>
-              <w:bidi/>
-              <w:spacing w:after="0"/>
-            </w:pPr>
-            <w:r>
-              <w:rPr>
-                <w:rFonts w:ascii="Arial" w:cs="Arial" w:eastAsia="Arial" w:hAnsi="Arial"/>
-                <w:sz w:val="19"/>
-                <w:szCs w:val="19"/>
-                <w:rtl/>
-              </w:rPr>
-              <w:t xml:space="preserve">גבוהה</w:t>
-            </w:r>
-          </w:p>
-        </w:tc>
-        <w:tc>
-          <w:tcPr>
-            <w:tcW w:type="dxa" w:w="1055"/>
-            <w:tcBorders>
-              <w:top w:val="single" w:color="BFBFBF" w:sz="4"/>
-              <w:left w:val="single" w:color="BFBFBF" w:sz="4"/>
-              <w:bottom w:val="single" w:color="BFBFBF" w:sz="4"/>
-              <w:right w:val="single" w:color="BFBFBF" w:sz="4"/>
-            </w:tcBorders>
-            <w:tcMar>
-              <w:top w:type="dxa" w:w="60"/>
-              <w:left w:type="dxa" w:w="100"/>
-              <w:bottom w:type="dxa" w:w="60"/>
-              <w:right w:type="dxa" w:w="100"/>
-            </w:tcMar>
-          </w:tcPr>
-          <w:p>
-            <w:pPr>
-              <w:bidi/>
-              <w:spacing w:after="0"/>
-            </w:pPr>
-            <w:r>
-              <w:rPr>
-                <w:rFonts w:ascii="Arial" w:cs="Arial" w:eastAsia="Arial" w:hAnsi="Arial"/>
-                <w:sz w:val="19"/>
-                <w:szCs w:val="19"/>
-                <w:rtl/>
-              </w:rPr>
-              <w:t xml:space="preserve">גבוהה</w:t>
-            </w:r>
-          </w:p>
-        </w:tc>
-        <w:tc>
-          <w:tcPr>
-            <w:tcW w:type="dxa" w:w="4222"/>
-            <w:tcBorders>
-              <w:top w:val="single" w:color="BFBFBF" w:sz="4"/>
-              <w:left w:val="single" w:color="BFBFBF" w:sz="4"/>
-              <w:bottom w:val="single" w:color="BFBFBF" w:sz="4"/>
-              <w:right w:val="single" w:color="BFBFBF" w:sz="4"/>
-            </w:tcBorders>
-            <w:tcMar>
-              <w:top w:type="dxa" w:w="60"/>
-              <w:left w:type="dxa" w:w="100"/>
-              <w:bottom w:type="dxa" w:w="60"/>
-              <w:right w:type="dxa" w:w="100"/>
-            </w:tcMar>
-          </w:tcPr>
-          <w:p>
-            <w:pPr>
-              <w:bidi/>
-              <w:spacing w:after="0"/>
-            </w:pPr>
-            <w:r>
-              <w:rPr>
-                <w:rFonts w:ascii="Arial" w:cs="Arial" w:eastAsia="Arial" w:hAnsi="Arial"/>
-                <w:sz w:val="19"/>
-                <w:szCs w:val="19"/>
-                <w:rtl/>
-              </w:rPr>
-              <w:t xml:space="preserve">למנות בעלים ולתקצב 0.2-0.3 משרה </w:t>
-            </w:r>
+            <w:tcW w:type="dxa" w:w="3696"/>
+            <w:tcBorders>
+              <w:top w:val="single" w:color="BFBFBF" w:sz="4"/>
+              <w:left w:val="single" w:color="BFBFBF" w:sz="4"/>
+              <w:bottom w:val="single" w:color="BFBFBF" w:sz="4"/>
+              <w:right w:val="single" w:color="BFBFBF" w:sz="4"/>
+            </w:tcBorders>
+            <w:tcMar>
+              <w:top w:type="dxa" w:w="60"/>
+              <w:left w:type="dxa" w:w="100"/>
+              <w:bottom w:type="dxa" w:w="60"/>
+              <w:right w:type="dxa" w:w="100"/>
+            </w:tcMar>
+          </w:tcPr>
+          <w:p>
+            <w:pPr>
+              <w:bidi/>
+              <w:spacing w:after="0"/>
+            </w:pPr>
             <w:r>
               <w:rPr>
                 <w:rFonts w:ascii="Arial" w:cs="Arial" w:eastAsia="Arial" w:hAnsi="Arial"/>
@@ -8308,16 +10718,112 @@
                 <w:szCs w:val="19"/>
                 <w:rtl/>
               </w:rPr>
-              <w:t xml:space="preserve">לפני</w:t>
-            </w:r>
-            <w:r>
-              <w:rPr>
-                <w:rFonts w:ascii="Arial" w:cs="Arial" w:eastAsia="Arial" w:hAnsi="Arial"/>
-                <w:sz w:val="19"/>
-                <w:szCs w:val="19"/>
-                <w:rtl/>
-              </w:rPr>
-              <w:t xml:space="preserve"> תחילת הפיתוח</w:t>
+              <w:t xml:space="preserve">תלות באדם אחד:</w:t>
+            </w:r>
+            <w:r>
+              <w:rPr>
+                <w:rFonts w:ascii="Arial" w:cs="Arial" w:eastAsia="Arial" w:hAnsi="Arial"/>
+                <w:sz w:val="19"/>
+                <w:szCs w:val="19"/>
+                <w:rtl/>
+              </w:rPr>
+              <w:t xml:space="preserve"> מפתח יחיד שמכיר את המערכת עוזב או לא זמין</w:t>
+            </w:r>
+          </w:p>
+        </w:tc>
+        <w:tc>
+          <w:tcPr>
+            <w:tcW w:type="dxa" w:w="990"/>
+            <w:tcBorders>
+              <w:top w:val="single" w:color="BFBFBF" w:sz="4"/>
+              <w:left w:val="single" w:color="BFBFBF" w:sz="4"/>
+              <w:bottom w:val="single" w:color="BFBFBF" w:sz="4"/>
+              <w:right w:val="single" w:color="BFBFBF" w:sz="4"/>
+            </w:tcBorders>
+            <w:tcMar>
+              <w:top w:type="dxa" w:w="60"/>
+              <w:left w:type="dxa" w:w="100"/>
+              <w:bottom w:type="dxa" w:w="60"/>
+              <w:right w:type="dxa" w:w="100"/>
+            </w:tcMar>
+          </w:tcPr>
+          <w:p>
+            <w:pPr>
+              <w:bidi/>
+              <w:spacing w:after="0"/>
+            </w:pPr>
+            <w:r>
+              <w:rPr>
+                <w:rFonts w:ascii="Arial" w:cs="Arial" w:eastAsia="Arial" w:hAnsi="Arial"/>
+                <w:sz w:val="19"/>
+                <w:szCs w:val="19"/>
+                <w:rtl/>
+              </w:rPr>
+              <w:t xml:space="preserve">בינונית</w:t>
+            </w:r>
+          </w:p>
+        </w:tc>
+        <w:tc>
+          <w:tcPr>
+            <w:tcW w:type="dxa" w:w="990"/>
+            <w:tcBorders>
+              <w:top w:val="single" w:color="BFBFBF" w:sz="4"/>
+              <w:left w:val="single" w:color="BFBFBF" w:sz="4"/>
+              <w:bottom w:val="single" w:color="BFBFBF" w:sz="4"/>
+              <w:right w:val="single" w:color="BFBFBF" w:sz="4"/>
+            </w:tcBorders>
+            <w:tcMar>
+              <w:top w:type="dxa" w:w="60"/>
+              <w:left w:type="dxa" w:w="100"/>
+              <w:bottom w:type="dxa" w:w="60"/>
+              <w:right w:type="dxa" w:w="100"/>
+            </w:tcMar>
+          </w:tcPr>
+          <w:p>
+            <w:pPr>
+              <w:bidi/>
+              <w:spacing w:after="0"/>
+            </w:pPr>
+            <w:r>
+              <w:rPr>
+                <w:rFonts w:ascii="Arial" w:cs="Arial" w:eastAsia="Arial" w:hAnsi="Arial"/>
+                <w:sz w:val="19"/>
+                <w:szCs w:val="19"/>
+                <w:rtl/>
+              </w:rPr>
+              <w:t xml:space="preserve">גבוהה</w:t>
+            </w:r>
+          </w:p>
+        </w:tc>
+        <w:tc>
+          <w:tcPr>
+            <w:tcW w:type="dxa" w:w="3962"/>
+            <w:tcBorders>
+              <w:top w:val="single" w:color="BFBFBF" w:sz="4"/>
+              <w:left w:val="single" w:color="BFBFBF" w:sz="4"/>
+              <w:bottom w:val="single" w:color="BFBFBF" w:sz="4"/>
+              <w:right w:val="single" w:color="BFBFBF" w:sz="4"/>
+            </w:tcBorders>
+            <w:tcMar>
+              <w:top w:type="dxa" w:w="60"/>
+              <w:left w:type="dxa" w:w="100"/>
+              <w:bottom w:type="dxa" w:w="60"/>
+              <w:right w:type="dxa" w:w="100"/>
+            </w:tcMar>
+          </w:tcPr>
+          <w:p>
+            <w:pPr>
+              <w:bidi/>
+              <w:spacing w:after="0"/>
+            </w:pPr>
+            <w:r>
+              <w:rPr>
+                <w:rFonts w:ascii="Arial" w:cs="Arial" w:eastAsia="Arial" w:hAnsi="Arial"/>
+                <w:sz w:val="19"/>
+                <w:szCs w:val="19"/>
+                <w:rtl/>
+              </w:rPr>
+              <w:t xml:space="preserve">תיעוד, code review על ידי מפתח נוסף בארגון, ומפתח גיבוי שמכיר את הקוד ברמה בסיסית</w:t>
             </w:r>
           </w:p>
         </w:tc>
@@ -8328,50 +10834,39 @@
         </w:trPr>
         <w:tc>
           <w:tcPr>
-            <w:tcW w:type="dxa" w:w="3306"/>
-            <w:tcBorders>
-              <w:top w:val="single" w:color="BFBFBF" w:sz="4"/>
-              <w:left w:val="single" w:color="BFBFBF" w:sz="4"/>
-              <w:bottom w:val="single" w:color="BFBFBF" w:sz="4"/>
-              <w:right w:val="single" w:color="BFBFBF" w:sz="4"/>
-            </w:tcBorders>
-            <w:tcMar>
-              <w:top w:type="dxa" w:w="60"/>
-              <w:left w:type="dxa" w:w="100"/>
-              <w:bottom w:type="dxa" w:w="60"/>
-              <w:right w:type="dxa" w:w="100"/>
-            </w:tcMar>
-          </w:tcPr>
-          <w:p>
-            <w:pPr>
-              <w:bidi/>
-              <w:spacing w:after="0"/>
-            </w:pPr>
-            <w:r>
-              <w:rPr>
-                <w:rFonts w:ascii="Arial" w:cs="Arial" w:eastAsia="Arial" w:hAnsi="Arial"/>
-                <w:b/>
-                <w:bCs/>
-                <w:sz w:val="19"/>
-                <w:szCs w:val="19"/>
-                <w:rtl/>
-              </w:rPr>
-              <w:t xml:space="preserve">זחילת היקף:</w:t>
-            </w:r>
-            <w:r>
-              <w:rPr>
-                <w:rFonts w:ascii="Arial" w:cs="Arial" w:eastAsia="Arial" w:hAnsi="Arial"/>
-                <w:sz w:val="19"/>
-                <w:szCs w:val="19"/>
-                <w:rtl/>
-              </w:rPr>
-              <w:t xml:space="preserve"> המסך הופך בהדרגה לכלי BI שנבנה בקוד</w:t>
-            </w:r>
-          </w:p>
-        </w:tc>
-        <w:tc>
-          <w:tcPr>
-            <w:tcW w:type="dxa" w:w="1055"/>
+            <w:tcW w:type="dxa" w:w="3696"/>
+            <w:tcBorders>
+              <w:top w:val="single" w:color="BFBFBF" w:sz="4"/>
+              <w:left w:val="single" w:color="BFBFBF" w:sz="4"/>
+              <w:bottom w:val="single" w:color="BFBFBF" w:sz="4"/>
+              <w:right w:val="single" w:color="BFBFBF" w:sz="4"/>
+            </w:tcBorders>
+            <w:tcMar>
+              <w:top w:type="dxa" w:w="60"/>
+              <w:left w:type="dxa" w:w="100"/>
+              <w:bottom w:type="dxa" w:w="60"/>
+              <w:right w:type="dxa" w:w="100"/>
+            </w:tcMar>
+          </w:tcPr>
+          <w:p>
+            <w:pPr>
+              <w:bidi/>
+              <w:spacing w:after="0"/>
+            </w:pPr>
+            <w:r>
+              <w:rPr>
+                <w:rFonts w:ascii="Arial" w:cs="Arial" w:eastAsia="Arial" w:hAnsi="Arial"/>
+                <w:sz w:val="19"/>
+                <w:szCs w:val="19"/>
+                <w:rtl/>
+              </w:rPr>
+              <w:t xml:space="preserve">המפתח מתחזק וגם מפתח, ושני הדברים נתקעים</w:t>
+            </w:r>
+          </w:p>
+        </w:tc>
+        <w:tc>
+          <w:tcPr>
+            <w:tcW w:type="dxa" w:w="990"/>
             <w:tcBorders>
               <w:top w:val="single" w:color="BFBFBF" w:sz="4"/>
               <w:left w:val="single" w:color="BFBFBF" w:sz="4"/>
@@ -8403,65 +10898,65 @@
         </w:tc>
         <w:tc>
           <w:tcPr>
-            <w:tcW w:type="dxa" w:w="1055"/>
-            <w:tcBorders>
-              <w:top w:val="single" w:color="BFBFBF" w:sz="4"/>
-              <w:left w:val="single" w:color="BFBFBF" w:sz="4"/>
-              <w:bottom w:val="single" w:color="BFBFBF" w:sz="4"/>
-              <w:right w:val="single" w:color="BFBFBF" w:sz="4"/>
-            </w:tcBorders>
-            <w:tcMar>
-              <w:top w:type="dxa" w:w="60"/>
-              <w:left w:type="dxa" w:w="100"/>
-              <w:bottom w:type="dxa" w:w="60"/>
-              <w:right w:type="dxa" w:w="100"/>
-            </w:tcMar>
-          </w:tcPr>
-          <w:p>
-            <w:pPr>
-              <w:bidi/>
-              <w:spacing w:after="0"/>
-            </w:pPr>
-            <w:r>
-              <w:rPr>
-                <w:rFonts w:ascii="Arial" w:cs="Arial" w:eastAsia="Arial" w:hAnsi="Arial"/>
-                <w:sz w:val="19"/>
-                <w:szCs w:val="19"/>
-                <w:rtl/>
-              </w:rPr>
-              <w:t xml:space="preserve">גבוהה</w:t>
-            </w:r>
-          </w:p>
-        </w:tc>
-        <w:tc>
-          <w:tcPr>
-            <w:tcW w:type="dxa" w:w="4222"/>
-            <w:tcBorders>
-              <w:top w:val="single" w:color="BFBFBF" w:sz="4"/>
-              <w:left w:val="single" w:color="BFBFBF" w:sz="4"/>
-              <w:bottom w:val="single" w:color="BFBFBF" w:sz="4"/>
-              <w:right w:val="single" w:color="BFBFBF" w:sz="4"/>
-            </w:tcBorders>
-            <w:tcMar>
-              <w:top w:type="dxa" w:w="60"/>
-              <w:left w:type="dxa" w:w="100"/>
-              <w:bottom w:type="dxa" w:w="60"/>
-              <w:right w:type="dxa" w:w="100"/>
-            </w:tcMar>
-          </w:tcPr>
-          <w:p>
-            <w:pPr>
-              <w:bidi/>
-              <w:spacing w:after="0"/>
-            </w:pPr>
-            <w:r>
-              <w:rPr>
-                <w:rFonts w:ascii="Arial" w:cs="Arial" w:eastAsia="Arial" w:hAnsi="Arial"/>
-                <w:sz w:val="19"/>
-                <w:szCs w:val="19"/>
-                <w:rtl/>
-              </w:rPr>
-              <w:t xml:space="preserve">ההיקף סגור. הגלים האנליטיים מחכים להחלטה נפרדת על כלי BI (סעיף 0)</w:t>
+            <w:tcW w:type="dxa" w:w="990"/>
+            <w:tcBorders>
+              <w:top w:val="single" w:color="BFBFBF" w:sz="4"/>
+              <w:left w:val="single" w:color="BFBFBF" w:sz="4"/>
+              <w:bottom w:val="single" w:color="BFBFBF" w:sz="4"/>
+              <w:right w:val="single" w:color="BFBFBF" w:sz="4"/>
+            </w:tcBorders>
+            <w:tcMar>
+              <w:top w:type="dxa" w:w="60"/>
+              <w:left w:type="dxa" w:w="100"/>
+              <w:bottom w:type="dxa" w:w="60"/>
+              <w:right w:type="dxa" w:w="100"/>
+            </w:tcMar>
+          </w:tcPr>
+          <w:p>
+            <w:pPr>
+              <w:bidi/>
+              <w:spacing w:after="0"/>
+            </w:pPr>
+            <w:r>
+              <w:rPr>
+                <w:rFonts w:ascii="Arial" w:cs="Arial" w:eastAsia="Arial" w:hAnsi="Arial"/>
+                <w:sz w:val="19"/>
+                <w:szCs w:val="19"/>
+                <w:rtl/>
+              </w:rPr>
+              <w:t xml:space="preserve">בינונית</w:t>
+            </w:r>
+          </w:p>
+        </w:tc>
+        <w:tc>
+          <w:tcPr>
+            <w:tcW w:type="dxa" w:w="3962"/>
+            <w:tcBorders>
+              <w:top w:val="single" w:color="BFBFBF" w:sz="4"/>
+              <w:left w:val="single" w:color="BFBFBF" w:sz="4"/>
+              <w:bottom w:val="single" w:color="BFBFBF" w:sz="4"/>
+              <w:right w:val="single" w:color="BFBFBF" w:sz="4"/>
+            </w:tcBorders>
+            <w:tcMar>
+              <w:top w:type="dxa" w:w="60"/>
+              <w:left w:type="dxa" w:w="100"/>
+              <w:bottom w:type="dxa" w:w="60"/>
+              <w:right w:type="dxa" w:w="100"/>
+            </w:tcMar>
+          </w:tcPr>
+          <w:p>
+            <w:pPr>
+              <w:bidi/>
+              <w:spacing w:after="0"/>
+            </w:pPr>
+            <w:r>
+              <w:rPr>
+                <w:rFonts w:ascii="Arial" w:cs="Arial" w:eastAsia="Arial" w:hAnsi="Arial"/>
+                <w:sz w:val="19"/>
+                <w:szCs w:val="19"/>
+                <w:rtl/>
+              </w:rPr>
+              <w:t xml:space="preserve">הקצאה ברורה: 20-30% לתחזוקה, והשאר לגל הבא. תיעדוף חודשי של בקשות</w:t>
             </w:r>
           </w:p>
         </w:tc>
@@ -8472,129 +10967,140 @@
         </w:trPr>
         <w:tc>
           <w:tcPr>
-            <w:tcW w:type="dxa" w:w="3306"/>
-            <w:tcBorders>
-              <w:top w:val="single" w:color="BFBFBF" w:sz="4"/>
-              <w:left w:val="single" w:color="BFBFBF" w:sz="4"/>
-              <w:bottom w:val="single" w:color="BFBFBF" w:sz="4"/>
-              <w:right w:val="single" w:color="BFBFBF" w:sz="4"/>
-            </w:tcBorders>
-            <w:tcMar>
-              <w:top w:type="dxa" w:w="60"/>
-              <w:left w:type="dxa" w:w="100"/>
-              <w:bottom w:type="dxa" w:w="60"/>
-              <w:right w:type="dxa" w:w="100"/>
-            </w:tcMar>
-          </w:tcPr>
-          <w:p>
-            <w:pPr>
-              <w:bidi/>
-              <w:spacing w:after="0"/>
-            </w:pPr>
-            <w:r>
-              <w:rPr>
-                <w:rFonts w:ascii="Arial" w:cs="Arial" w:eastAsia="Arial" w:hAnsi="Arial"/>
-                <w:sz w:val="19"/>
-                <w:szCs w:val="19"/>
-                <w:rtl/>
-              </w:rPr>
-              <w:t xml:space="preserve">מסך הקיר מחובר עם משתמש אישי</w:t>
-            </w:r>
-          </w:p>
-        </w:tc>
-        <w:tc>
-          <w:tcPr>
-            <w:tcW w:type="dxa" w:w="1055"/>
-            <w:tcBorders>
-              <w:top w:val="single" w:color="BFBFBF" w:sz="4"/>
-              <w:left w:val="single" w:color="BFBFBF" w:sz="4"/>
-              <w:bottom w:val="single" w:color="BFBFBF" w:sz="4"/>
-              <w:right w:val="single" w:color="BFBFBF" w:sz="4"/>
-            </w:tcBorders>
-            <w:tcMar>
-              <w:top w:type="dxa" w:w="60"/>
-              <w:left w:type="dxa" w:w="100"/>
-              <w:bottom w:type="dxa" w:w="60"/>
-              <w:right w:type="dxa" w:w="100"/>
-            </w:tcMar>
-          </w:tcPr>
-          <w:p>
-            <w:pPr>
-              <w:bidi/>
-              <w:spacing w:after="0"/>
-            </w:pPr>
-            <w:r>
-              <w:rPr>
-                <w:rFonts w:ascii="Arial" w:cs="Arial" w:eastAsia="Arial" w:hAnsi="Arial"/>
-                <w:sz w:val="19"/>
-                <w:szCs w:val="19"/>
-                <w:rtl/>
-              </w:rPr>
-              <w:t xml:space="preserve">בינונית</w:t>
-            </w:r>
-          </w:p>
-        </w:tc>
-        <w:tc>
-          <w:tcPr>
-            <w:tcW w:type="dxa" w:w="1055"/>
-            <w:tcBorders>
-              <w:top w:val="single" w:color="BFBFBF" w:sz="4"/>
-              <w:left w:val="single" w:color="BFBFBF" w:sz="4"/>
-              <w:bottom w:val="single" w:color="BFBFBF" w:sz="4"/>
-              <w:right w:val="single" w:color="BFBFBF" w:sz="4"/>
-            </w:tcBorders>
-            <w:tcMar>
-              <w:top w:type="dxa" w:w="60"/>
-              <w:left w:type="dxa" w:w="100"/>
-              <w:bottom w:type="dxa" w:w="60"/>
-              <w:right w:type="dxa" w:w="100"/>
-            </w:tcMar>
-          </w:tcPr>
-          <w:p>
-            <w:pPr>
-              <w:bidi/>
-              <w:spacing w:after="0"/>
-            </w:pPr>
-            <w:r>
-              <w:rPr>
-                <w:rFonts w:ascii="Arial" w:cs="Arial" w:eastAsia="Arial" w:hAnsi="Arial"/>
-                <w:sz w:val="19"/>
-                <w:szCs w:val="19"/>
-                <w:rtl/>
-              </w:rPr>
-              <w:t xml:space="preserve">בינונית (אבטחה)</w:t>
-            </w:r>
-          </w:p>
-        </w:tc>
-        <w:tc>
-          <w:tcPr>
-            <w:tcW w:type="dxa" w:w="4222"/>
-            <w:tcBorders>
-              <w:top w:val="single" w:color="BFBFBF" w:sz="4"/>
-              <w:left w:val="single" w:color="BFBFBF" w:sz="4"/>
-              <w:bottom w:val="single" w:color="BFBFBF" w:sz="4"/>
-              <w:right w:val="single" w:color="BFBFBF" w:sz="4"/>
-            </w:tcBorders>
-            <w:tcMar>
-              <w:top w:type="dxa" w:w="60"/>
-              <w:left w:type="dxa" w:w="100"/>
-              <w:bottom w:type="dxa" w:w="60"/>
-              <w:right w:type="dxa" w:w="100"/>
-            </w:tcMar>
-          </w:tcPr>
-          <w:p>
-            <w:pPr>
-              <w:bidi/>
-              <w:spacing w:after="0"/>
-            </w:pPr>
-            <w:r>
-              <w:rPr>
-                <w:rFonts w:ascii="Arial" w:cs="Arial" w:eastAsia="Arial" w:hAnsi="Arial"/>
-                <w:sz w:val="19"/>
-                <w:szCs w:val="19"/>
-                <w:rtl/>
-              </w:rPr>
-              <w:t xml:space="preserve">משתמש Kiosk ייעודי (5.3)</w:t>
+            <w:tcW w:type="dxa" w:w="3696"/>
+            <w:tcBorders>
+              <w:top w:val="single" w:color="BFBFBF" w:sz="4"/>
+              <w:left w:val="single" w:color="BFBFBF" w:sz="4"/>
+              <w:bottom w:val="single" w:color="BFBFBF" w:sz="4"/>
+              <w:right w:val="single" w:color="BFBFBF" w:sz="4"/>
+            </w:tcBorders>
+            <w:tcMar>
+              <w:top w:type="dxa" w:w="60"/>
+              <w:left w:type="dxa" w:w="100"/>
+              <w:bottom w:type="dxa" w:w="60"/>
+              <w:right w:type="dxa" w:w="100"/>
+            </w:tcMar>
+          </w:tcPr>
+          <w:p>
+            <w:pPr>
+              <w:bidi/>
+              <w:spacing w:after="0"/>
+            </w:pPr>
+            <w:r>
+              <w:rPr>
+                <w:rFonts w:ascii="Arial" w:cs="Arial" w:eastAsia="Arial" w:hAnsi="Arial"/>
+                <w:b/>
+                <w:bCs/>
+                <w:sz w:val="19"/>
+                <w:szCs w:val="19"/>
+                <w:rtl/>
+              </w:rPr>
+              <w:t xml:space="preserve">זחילת היקף:</w:t>
+            </w:r>
+            <w:r>
+              <w:rPr>
+                <w:rFonts w:ascii="Arial" w:cs="Arial" w:eastAsia="Arial" w:hAnsi="Arial"/>
+                <w:sz w:val="19"/>
+                <w:szCs w:val="19"/>
+                <w:rtl/>
+              </w:rPr>
+              <w:t xml:space="preserve"> כל בקשה חד-פעמית הופכת למסך חדש</w:t>
+            </w:r>
+          </w:p>
+        </w:tc>
+        <w:tc>
+          <w:tcPr>
+            <w:tcW w:type="dxa" w:w="990"/>
+            <w:tcBorders>
+              <w:top w:val="single" w:color="BFBFBF" w:sz="4"/>
+              <w:left w:val="single" w:color="BFBFBF" w:sz="4"/>
+              <w:bottom w:val="single" w:color="BFBFBF" w:sz="4"/>
+              <w:right w:val="single" w:color="BFBFBF" w:sz="4"/>
+            </w:tcBorders>
+            <w:tcMar>
+              <w:top w:type="dxa" w:w="60"/>
+              <w:left w:type="dxa" w:w="100"/>
+              <w:bottom w:type="dxa" w:w="60"/>
+              <w:right w:type="dxa" w:w="100"/>
+            </w:tcMar>
+          </w:tcPr>
+          <w:p>
+            <w:pPr>
+              <w:bidi/>
+              <w:spacing w:after="0"/>
+            </w:pPr>
+            <w:r>
+              <w:rPr>
+                <w:rFonts w:ascii="Arial" w:cs="Arial" w:eastAsia="Arial" w:hAnsi="Arial"/>
+                <w:sz w:val="19"/>
+                <w:szCs w:val="19"/>
+                <w:rtl/>
+              </w:rPr>
+              <w:t xml:space="preserve">גבוהה</w:t>
+            </w:r>
+          </w:p>
+        </w:tc>
+        <w:tc>
+          <w:tcPr>
+            <w:tcW w:type="dxa" w:w="990"/>
+            <w:tcBorders>
+              <w:top w:val="single" w:color="BFBFBF" w:sz="4"/>
+              <w:left w:val="single" w:color="BFBFBF" w:sz="4"/>
+              <w:bottom w:val="single" w:color="BFBFBF" w:sz="4"/>
+              <w:right w:val="single" w:color="BFBFBF" w:sz="4"/>
+            </w:tcBorders>
+            <w:tcMar>
+              <w:top w:type="dxa" w:w="60"/>
+              <w:left w:type="dxa" w:w="100"/>
+              <w:bottom w:type="dxa" w:w="60"/>
+              <w:right w:type="dxa" w:w="100"/>
+            </w:tcMar>
+          </w:tcPr>
+          <w:p>
+            <w:pPr>
+              <w:bidi/>
+              <w:spacing w:after="0"/>
+            </w:pPr>
+            <w:r>
+              <w:rPr>
+                <w:rFonts w:ascii="Arial" w:cs="Arial" w:eastAsia="Arial" w:hAnsi="Arial"/>
+                <w:sz w:val="19"/>
+                <w:szCs w:val="19"/>
+                <w:rtl/>
+              </w:rPr>
+              <w:t xml:space="preserve">גבוהה</w:t>
+            </w:r>
+          </w:p>
+        </w:tc>
+        <w:tc>
+          <w:tcPr>
+            <w:tcW w:type="dxa" w:w="3962"/>
+            <w:tcBorders>
+              <w:top w:val="single" w:color="BFBFBF" w:sz="4"/>
+              <w:left w:val="single" w:color="BFBFBF" w:sz="4"/>
+              <w:bottom w:val="single" w:color="BFBFBF" w:sz="4"/>
+              <w:right w:val="single" w:color="BFBFBF" w:sz="4"/>
+            </w:tcBorders>
+            <w:tcMar>
+              <w:top w:type="dxa" w:w="60"/>
+              <w:left w:type="dxa" w:w="100"/>
+              <w:bottom w:type="dxa" w:w="60"/>
+              <w:right w:type="dxa" w:w="100"/>
+            </w:tcMar>
+          </w:tcPr>
+          <w:p>
+            <w:pPr>
+              <w:bidi/>
+              <w:spacing w:after="0"/>
+            </w:pPr>
+            <w:r>
+              <w:rPr>
+                <w:rFonts w:ascii="Arial" w:cs="Arial" w:eastAsia="Arial" w:hAnsi="Arial"/>
+                <w:sz w:val="19"/>
+                <w:szCs w:val="19"/>
+                <w:rtl/>
+              </w:rPr>
+              <w:t xml:space="preserve">ייצוא CSV לשאלות חד-פעמיות, ותיעדוף חודשי לבקשות למסכים חדשים (7.4)</w:t>
             </w:r>
           </w:p>
         </w:tc>
@@ -8605,71 +11111,39 @@
         </w:trPr>
         <w:tc>
           <w:tcPr>
-            <w:tcW w:type="dxa" w:w="3306"/>
-            <w:tcBorders>
-              <w:top w:val="single" w:color="BFBFBF" w:sz="4"/>
-              <w:left w:val="single" w:color="BFBFBF" w:sz="4"/>
-              <w:bottom w:val="single" w:color="BFBFBF" w:sz="4"/>
-              <w:right w:val="single" w:color="BFBFBF" w:sz="4"/>
-            </w:tcBorders>
-            <w:tcMar>
-              <w:top w:type="dxa" w:w="60"/>
-              <w:left w:type="dxa" w:w="100"/>
-              <w:bottom w:type="dxa" w:w="60"/>
-              <w:right w:type="dxa" w:w="100"/>
-            </w:tcMar>
-          </w:tcPr>
-          <w:p>
-            <w:pPr>
-              <w:bidi/>
-              <w:spacing w:after="0"/>
-            </w:pPr>
-            <w:r>
-              <w:rPr>
-                <w:rFonts w:ascii="Arial" w:cs="Arial" w:eastAsia="Arial" w:hAnsi="Arial"/>
-                <w:sz w:val="19"/>
-                <w:szCs w:val="19"/>
-                <w:rtl/>
-              </w:rPr>
-              <w:t xml:space="preserve">ה-DW "real time" בפועל עם פער גדול</w:t>
-            </w:r>
-          </w:p>
-        </w:tc>
-        <w:tc>
-          <w:tcPr>
-            <w:tcW w:type="dxa" w:w="1055"/>
-            <w:tcBorders>
-              <w:top w:val="single" w:color="BFBFBF" w:sz="4"/>
-              <w:left w:val="single" w:color="BFBFBF" w:sz="4"/>
-              <w:bottom w:val="single" w:color="BFBFBF" w:sz="4"/>
-              <w:right w:val="single" w:color="BFBFBF" w:sz="4"/>
-            </w:tcBorders>
-            <w:tcMar>
-              <w:top w:type="dxa" w:w="60"/>
-              <w:left w:type="dxa" w:w="100"/>
-              <w:bottom w:type="dxa" w:w="60"/>
-              <w:right w:type="dxa" w:w="100"/>
-            </w:tcMar>
-          </w:tcPr>
-          <w:p>
-            <w:pPr>
-              <w:bidi/>
-              <w:spacing w:after="0"/>
-            </w:pPr>
-            <w:r>
-              <w:rPr>
-                <w:rFonts w:ascii="Arial" w:cs="Arial" w:eastAsia="Arial" w:hAnsi="Arial"/>
-                <w:sz w:val="19"/>
-                <w:szCs w:val="19"/>
-                <w:rtl/>
-              </w:rPr>
-              <w:t xml:space="preserve">נמוכה-בינונית</w:t>
-            </w:r>
-          </w:p>
-        </w:tc>
-        <w:tc>
-          <w:tcPr>
-            <w:tcW w:type="dxa" w:w="1055"/>
+            <w:tcW w:type="dxa" w:w="3696"/>
+            <w:tcBorders>
+              <w:top w:val="single" w:color="BFBFBF" w:sz="4"/>
+              <w:left w:val="single" w:color="BFBFBF" w:sz="4"/>
+              <w:bottom w:val="single" w:color="BFBFBF" w:sz="4"/>
+              <w:right w:val="single" w:color="BFBFBF" w:sz="4"/>
+            </w:tcBorders>
+            <w:tcMar>
+              <w:top w:type="dxa" w:w="60"/>
+              <w:left w:type="dxa" w:w="100"/>
+              <w:bottom w:type="dxa" w:w="60"/>
+              <w:right w:type="dxa" w:w="100"/>
+            </w:tcMar>
+          </w:tcPr>
+          <w:p>
+            <w:pPr>
+              <w:bidi/>
+              <w:spacing w:after="0"/>
+            </w:pPr>
+            <w:r>
+              <w:rPr>
+                <w:rFonts w:ascii="Arial" w:cs="Arial" w:eastAsia="Arial" w:hAnsi="Arial"/>
+                <w:sz w:val="19"/>
+                <w:szCs w:val="19"/>
+                <w:rtl/>
+              </w:rPr>
+              <w:t xml:space="preserve">מסך הקיר מחובר עם משתמש אישי</w:t>
+            </w:r>
+          </w:p>
+        </w:tc>
+        <w:tc>
+          <w:tcPr>
+            <w:tcW w:type="dxa" w:w="990"/>
             <w:tcBorders>
               <w:top w:val="single" w:color="BFBFBF" w:sz="4"/>
               <w:left w:val="single" w:color="BFBFBF" w:sz="4"/>
@@ -8701,33 +11175,65 @@
         </w:tc>
         <w:tc>
           <w:tcPr>
-            <w:tcW w:type="dxa" w:w="4222"/>
-            <w:tcBorders>
-              <w:top w:val="single" w:color="BFBFBF" w:sz="4"/>
-              <w:left w:val="single" w:color="BFBFBF" w:sz="4"/>
-              <w:bottom w:val="single" w:color="BFBFBF" w:sz="4"/>
-              <w:right w:val="single" w:color="BFBFBF" w:sz="4"/>
-            </w:tcBorders>
-            <w:tcMar>
-              <w:top w:type="dxa" w:w="60"/>
-              <w:left w:type="dxa" w:w="100"/>
-              <w:bottom w:type="dxa" w:w="60"/>
-              <w:right w:type="dxa" w:w="100"/>
-            </w:tcMar>
-          </w:tcPr>
-          <w:p>
-            <w:pPr>
-              <w:bidi/>
-              <w:spacing w:after="0"/>
-            </w:pPr>
-            <w:r>
-              <w:rPr>
-                <w:rFonts w:ascii="Arial" w:cs="Arial" w:eastAsia="Arial" w:hAnsi="Arial"/>
-                <w:sz w:val="19"/>
-                <w:szCs w:val="19"/>
-                <w:rtl/>
-              </w:rPr>
-              <w:t xml:space="preserve">לבדוק בשבוע 1</w:t>
+            <w:tcW w:type="dxa" w:w="990"/>
+            <w:tcBorders>
+              <w:top w:val="single" w:color="BFBFBF" w:sz="4"/>
+              <w:left w:val="single" w:color="BFBFBF" w:sz="4"/>
+              <w:bottom w:val="single" w:color="BFBFBF" w:sz="4"/>
+              <w:right w:val="single" w:color="BFBFBF" w:sz="4"/>
+            </w:tcBorders>
+            <w:tcMar>
+              <w:top w:type="dxa" w:w="60"/>
+              <w:left w:type="dxa" w:w="100"/>
+              <w:bottom w:type="dxa" w:w="60"/>
+              <w:right w:type="dxa" w:w="100"/>
+            </w:tcMar>
+          </w:tcPr>
+          <w:p>
+            <w:pPr>
+              <w:bidi/>
+              <w:spacing w:after="0"/>
+            </w:pPr>
+            <w:r>
+              <w:rPr>
+                <w:rFonts w:ascii="Arial" w:cs="Arial" w:eastAsia="Arial" w:hAnsi="Arial"/>
+                <w:sz w:val="19"/>
+                <w:szCs w:val="19"/>
+                <w:rtl/>
+              </w:rPr>
+              <w:t xml:space="preserve">בינונית (אבטחה)</w:t>
+            </w:r>
+          </w:p>
+        </w:tc>
+        <w:tc>
+          <w:tcPr>
+            <w:tcW w:type="dxa" w:w="3962"/>
+            <w:tcBorders>
+              <w:top w:val="single" w:color="BFBFBF" w:sz="4"/>
+              <w:left w:val="single" w:color="BFBFBF" w:sz="4"/>
+              <w:bottom w:val="single" w:color="BFBFBF" w:sz="4"/>
+              <w:right w:val="single" w:color="BFBFBF" w:sz="4"/>
+            </w:tcBorders>
+            <w:tcMar>
+              <w:top w:type="dxa" w:w="60"/>
+              <w:left w:type="dxa" w:w="100"/>
+              <w:bottom w:type="dxa" w:w="60"/>
+              <w:right w:type="dxa" w:w="100"/>
+            </w:tcMar>
+          </w:tcPr>
+          <w:p>
+            <w:pPr>
+              <w:bidi/>
+              <w:spacing w:after="0"/>
+            </w:pPr>
+            <w:r>
+              <w:rPr>
+                <w:rFonts w:ascii="Arial" w:cs="Arial" w:eastAsia="Arial" w:hAnsi="Arial"/>
+                <w:sz w:val="19"/>
+                <w:szCs w:val="19"/>
+                <w:rtl/>
+              </w:rPr>
+              <w:t xml:space="preserve">משתמש Kiosk ייעודי (5.3)</w:t>
             </w:r>
           </w:p>
         </w:tc>
@@ -8738,7 +11244,140 @@
         </w:trPr>
         <w:tc>
           <w:tcPr>
-            <w:tcW w:type="dxa" w:w="3306"/>
+            <w:tcW w:type="dxa" w:w="3696"/>
+            <w:tcBorders>
+              <w:top w:val="single" w:color="BFBFBF" w:sz="4"/>
+              <w:left w:val="single" w:color="BFBFBF" w:sz="4"/>
+              <w:bottom w:val="single" w:color="BFBFBF" w:sz="4"/>
+              <w:right w:val="single" w:color="BFBFBF" w:sz="4"/>
+            </w:tcBorders>
+            <w:tcMar>
+              <w:top w:type="dxa" w:w="60"/>
+              <w:left w:type="dxa" w:w="100"/>
+              <w:bottom w:type="dxa" w:w="60"/>
+              <w:right w:type="dxa" w:w="100"/>
+            </w:tcMar>
+          </w:tcPr>
+          <w:p>
+            <w:pPr>
+              <w:bidi/>
+              <w:spacing w:after="0"/>
+            </w:pPr>
+            <w:r>
+              <w:rPr>
+                <w:rFonts w:ascii="Arial" w:cs="Arial" w:eastAsia="Arial" w:hAnsi="Arial"/>
+                <w:sz w:val="19"/>
+                <w:szCs w:val="19"/>
+                <w:rtl/>
+              </w:rPr>
+              <w:t xml:space="preserve">ה-DW "real time" בפועל עם פער גדול</w:t>
+            </w:r>
+          </w:p>
+        </w:tc>
+        <w:tc>
+          <w:tcPr>
+            <w:tcW w:type="dxa" w:w="990"/>
+            <w:tcBorders>
+              <w:top w:val="single" w:color="BFBFBF" w:sz="4"/>
+              <w:left w:val="single" w:color="BFBFBF" w:sz="4"/>
+              <w:bottom w:val="single" w:color="BFBFBF" w:sz="4"/>
+              <w:right w:val="single" w:color="BFBFBF" w:sz="4"/>
+            </w:tcBorders>
+            <w:tcMar>
+              <w:top w:type="dxa" w:w="60"/>
+              <w:left w:type="dxa" w:w="100"/>
+              <w:bottom w:type="dxa" w:w="60"/>
+              <w:right w:type="dxa" w:w="100"/>
+            </w:tcMar>
+          </w:tcPr>
+          <w:p>
+            <w:pPr>
+              <w:bidi/>
+              <w:spacing w:after="0"/>
+            </w:pPr>
+            <w:r>
+              <w:rPr>
+                <w:rFonts w:ascii="Arial" w:cs="Arial" w:eastAsia="Arial" w:hAnsi="Arial"/>
+                <w:sz w:val="19"/>
+                <w:szCs w:val="19"/>
+                <w:rtl/>
+              </w:rPr>
+              <w:t xml:space="preserve">נמוכה-בינונית</w:t>
+            </w:r>
+          </w:p>
+        </w:tc>
+        <w:tc>
+          <w:tcPr>
+            <w:tcW w:type="dxa" w:w="990"/>
+            <w:tcBorders>
+              <w:top w:val="single" w:color="BFBFBF" w:sz="4"/>
+              <w:left w:val="single" w:color="BFBFBF" w:sz="4"/>
+              <w:bottom w:val="single" w:color="BFBFBF" w:sz="4"/>
+              <w:right w:val="single" w:color="BFBFBF" w:sz="4"/>
+            </w:tcBorders>
+            <w:tcMar>
+              <w:top w:type="dxa" w:w="60"/>
+              <w:left w:type="dxa" w:w="100"/>
+              <w:bottom w:type="dxa" w:w="60"/>
+              <w:right w:type="dxa" w:w="100"/>
+            </w:tcMar>
+          </w:tcPr>
+          <w:p>
+            <w:pPr>
+              <w:bidi/>
+              <w:spacing w:after="0"/>
+            </w:pPr>
+            <w:r>
+              <w:rPr>
+                <w:rFonts w:ascii="Arial" w:cs="Arial" w:eastAsia="Arial" w:hAnsi="Arial"/>
+                <w:sz w:val="19"/>
+                <w:szCs w:val="19"/>
+                <w:rtl/>
+              </w:rPr>
+              <w:t xml:space="preserve">בינונית</w:t>
+            </w:r>
+          </w:p>
+        </w:tc>
+        <w:tc>
+          <w:tcPr>
+            <w:tcW w:type="dxa" w:w="3962"/>
+            <w:tcBorders>
+              <w:top w:val="single" w:color="BFBFBF" w:sz="4"/>
+              <w:left w:val="single" w:color="BFBFBF" w:sz="4"/>
+              <w:bottom w:val="single" w:color="BFBFBF" w:sz="4"/>
+              <w:right w:val="single" w:color="BFBFBF" w:sz="4"/>
+            </w:tcBorders>
+            <w:tcMar>
+              <w:top w:type="dxa" w:w="60"/>
+              <w:left w:type="dxa" w:w="100"/>
+              <w:bottom w:type="dxa" w:w="60"/>
+              <w:right w:type="dxa" w:w="100"/>
+            </w:tcMar>
+          </w:tcPr>
+          <w:p>
+            <w:pPr>
+              <w:bidi/>
+              <w:spacing w:after="0"/>
+            </w:pPr>
+            <w:r>
+              <w:rPr>
+                <w:rFonts w:ascii="Arial" w:cs="Arial" w:eastAsia="Arial" w:hAnsi="Arial"/>
+                <w:sz w:val="19"/>
+                <w:szCs w:val="19"/>
+                <w:rtl/>
+              </w:rPr>
+              <w:t xml:space="preserve">לבדוק בשבוע 1</w:t>
+            </w:r>
+          </w:p>
+        </w:tc>
+      </w:tr>
+      <w:tr>
+        <w:trPr>
+          <w:tblHeader w:val="false"/>
+        </w:trPr>
+        <w:tc>
+          <w:tcPr>
+            <w:tcW w:type="dxa" w:w="3696"/>
             <w:tcBorders>
               <w:top w:val="single" w:color="BFBFBF" w:sz="4"/>
               <w:left w:val="single" w:color="BFBFBF" w:sz="4"/>
@@ -8770,7 +11409,7 @@
         </w:tc>
         <w:tc>
           <w:tcPr>
-            <w:tcW w:type="dxa" w:w="1055"/>
+            <w:tcW w:type="dxa" w:w="990"/>
             <w:tcBorders>
               <w:top w:val="single" w:color="BFBFBF" w:sz="4"/>
               <w:left w:val="single" w:color="BFBFBF" w:sz="4"/>
@@ -8802,7 +11441,7 @@
         </w:tc>
         <w:tc>
           <w:tcPr>
-            <w:tcW w:type="dxa" w:w="1055"/>
+            <w:tcW w:type="dxa" w:w="990"/>
             <w:tcBorders>
               <w:top w:val="single" w:color="BFBFBF" w:sz="4"/>
               <w:left w:val="single" w:color="BFBFBF" w:sz="4"/>
@@ -8834,7 +11473,7 @@
         </w:tc>
         <w:tc>
           <w:tcPr>
-            <w:tcW w:type="dxa" w:w="4222"/>
+            <w:tcW w:type="dxa" w:w="3962"/>
             <w:tcBorders>
               <w:top w:val="single" w:color="BFBFBF" w:sz="4"/>
               <w:left w:val="single" w:color="BFBFBF" w:sz="4"/>
@@ -9174,11 +11813,42 @@
             <w:r>
               <w:rPr>
                 <w:rFonts w:ascii="Arial" w:cs="Arial" w:eastAsia="Arial" w:hAnsi="Arial"/>
-                <w:sz w:val="19"/>
-                <w:szCs w:val="19"/>
-                <w:rtl/>
-              </w:rPr>
-              <w:t xml:space="preserve">מי מתחזק את המערכת אחרי העלייה?</w:t>
+                <w:b/>
+                <w:bCs/>
+                <w:sz w:val="19"/>
+                <w:szCs w:val="19"/>
+                <w:rtl/>
+              </w:rPr>
+              <w:t xml:space="preserve">הוחלט:</w:t>
+            </w:r>
+            <w:r>
+              <w:rPr>
+                <w:rFonts w:ascii="Arial" w:cs="Arial" w:eastAsia="Arial" w:hAnsi="Arial"/>
+                <w:sz w:val="19"/>
+                <w:szCs w:val="19"/>
+                <w:rtl/>
+              </w:rPr>
+              <w:t xml:space="preserve"> מפתח ו-DBA. </w:t>
+            </w:r>
+            <w:r>
+              <w:rPr>
+                <w:rFonts w:ascii="Arial" w:cs="Arial" w:eastAsia="Arial" w:hAnsi="Arial"/>
+                <w:b/>
+                <w:bCs/>
+                <w:sz w:val="19"/>
+                <w:szCs w:val="19"/>
+                <w:rtl/>
+              </w:rPr>
+              <w:t xml:space="preserve">פתוח:</w:t>
+            </w:r>
+            <w:r>
+              <w:rPr>
+                <w:rFonts w:ascii="Arial" w:cs="Arial" w:eastAsia="Arial" w:hAnsi="Arial"/>
+                <w:sz w:val="19"/>
+                <w:szCs w:val="19"/>
+                <w:rtl/>
+              </w:rPr>
+              <w:t xml:space="preserve"> כמה מהזמן שלהם מוקצה למערכת, והאם יש מפתח גיבוי</w:t>
             </w:r>
           </w:p>
         </w:tc>
@@ -9210,7 +11880,7 @@
                 <w:szCs w:val="19"/>
                 <w:rtl/>
               </w:rPr>
-              <w:t xml:space="preserve">בלי בעלים, המערכת מתיישנת ומפסיקה לעבוד</w:t>
+              <w:t xml:space="preserve">ראו 7.4</w:t>
             </w:r>
           </w:p>
         </w:tc>
@@ -9477,11 +12147,42 @@
             <w:r>
               <w:rPr>
                 <w:rFonts w:ascii="Arial" w:cs="Arial" w:eastAsia="Arial" w:hAnsi="Arial"/>
-                <w:sz w:val="19"/>
-                <w:szCs w:val="19"/>
-                <w:rtl/>
-              </w:rPr>
-              <w:t xml:space="preserve">מה עושים עם הגלים האנליטיים בלי Spotfire? כלי BI אחר שכבר יש בארגון, או פיתוח?</w:t>
+                <w:b/>
+                <w:bCs/>
+                <w:sz w:val="19"/>
+                <w:szCs w:val="19"/>
+                <w:rtl/>
+              </w:rPr>
+              <w:t xml:space="preserve">הוחלט:</w:t>
+            </w:r>
+            <w:r>
+              <w:rPr>
+                <w:rFonts w:ascii="Arial" w:cs="Arial" w:eastAsia="Arial" w:hAnsi="Arial"/>
+                <w:sz w:val="19"/>
+                <w:szCs w:val="19"/>
+                <w:rtl/>
+              </w:rPr>
+              <w:t xml:space="preserve"> פיתוח פנימי. </w:t>
+            </w:r>
+            <w:r>
+              <w:rPr>
+                <w:rFonts w:ascii="Arial" w:cs="Arial" w:eastAsia="Arial" w:hAnsi="Arial"/>
+                <w:b/>
+                <w:bCs/>
+                <w:sz w:val="19"/>
+                <w:szCs w:val="19"/>
+                <w:rtl/>
+              </w:rPr>
+              <w:t xml:space="preserve">פתוח:</w:t>
+            </w:r>
+            <w:r>
+              <w:rPr>
+                <w:rFonts w:ascii="Arial" w:cs="Arial" w:eastAsia="Arial" w:hAnsi="Arial"/>
+                <w:sz w:val="19"/>
+                <w:szCs w:val="19"/>
+                <w:rtl/>
+              </w:rPr>
+              <w:t xml:space="preserve"> האם רישיונות Microsoft 365 של החברה כבר כוללים Power BI (למשל במסגרת E5)?</w:t>
             </w:r>
           </w:p>
         </w:tc>
@@ -9513,7 +12214,7 @@
                 <w:szCs w:val="19"/>
                 <w:rtl/>
               </w:rPr>
-              <w:t xml:space="preserve">זו ההחלטה הגדולה יותר, והיא קובעת אם החלופה הזו משתלמת בטווח הארוך</w:t>
+              <w:t xml:space="preserve">אם כן, יש כלי BI בלי עלות נוספת, ואפשר לחסוך חלק גדול מהגל השני</w:t>
             </w:r>
           </w:p>
         </w:tc>
@@ -9874,6 +12575,12 @@
       <w:startOverride w:val="1"/>
     </w:lvlOverride>
   </w:num>
+  <w:num w:numId="3">
+    <w:abstractNumId w:val="3"/>
+    <w:lvlOverride w:ilvl="0">
+      <w:startOverride w:val="1"/>
+    </w:lvlOverride>
+  </w:num>
 </w:numbering>
 </file>
 

</xml_diff>